<commit_message>
added custom article input
</commit_message>
<xml_diff>
--- a/report/23i-0832_23i-0728_AI_project_report.docx
+++ b/report/23i-0832_23i-0728_AI_project_report.docx
@@ -5,18 +5,16 @@
     <w:p>
       <w:pPr>
         <w:pStyle w:val="Heading1"/>
-        <w:spacing w:before="0" w:after="120" w:line="275" w:lineRule="auto"/>
-        <w:rPr>
-          <w:rFonts w:ascii="Google Sans" w:eastAsia="Google Sans" w:hAnsi="Google Sans" w:cs="Google Sans"/>
-          <w:color w:val="1F1F1F"/>
-        </w:rPr>
-      </w:pPr>
-      <w:r>
-        <w:rPr>
-          <w:rFonts w:ascii="Google Sans" w:eastAsia="Google Sans" w:hAnsi="Google Sans" w:cs="Google Sans"/>
-          <w:color w:val="1F1F1F"/>
-        </w:rPr>
-        <w:t>Intelligent Reading Comprehension System</w:t>
+        <w:jc w:val="center"/>
+        <w:rPr>
+          <w:rFonts w:ascii="Google Sans" w:eastAsia="Google Sans" w:hAnsi="Google Sans" w:cs="Google Sans"/>
+        </w:rPr>
+      </w:pPr>
+      <w:r>
+        <w:rPr>
+          <w:rFonts w:ascii="Google Sans" w:eastAsia="Google Sans" w:hAnsi="Google Sans" w:cs="Google Sans"/>
+        </w:rPr>
+        <w:t>Intelligent Reading Comprehension and Verification System</w:t>
       </w:r>
     </w:p>
     <w:p>
@@ -28,27 +26,21 @@
           <w:right w:val="nil"/>
           <w:between w:val="nil"/>
         </w:pBdr>
-        <w:spacing w:after="240" w:line="275" w:lineRule="auto"/>
-        <w:rPr>
-          <w:rFonts w:ascii="Google Sans" w:eastAsia="Google Sans" w:hAnsi="Google Sans" w:cs="Google Sans"/>
-          <w:color w:val="1F1F1F"/>
-        </w:rPr>
-      </w:pPr>
-      <w:r>
+        <w:spacing w:line="300" w:lineRule="auto"/>
+        <w:jc w:val="center"/>
         <w:rPr>
           <w:rFonts w:ascii="Google Sans" w:eastAsia="Google Sans" w:hAnsi="Google Sans" w:cs="Google Sans"/>
           <w:b/>
           <w:bCs/>
-          <w:color w:val="1F1F1F"/>
-        </w:rPr>
-        <w:t>Students:</w:t>
-      </w:r>
-      <w:r>
-        <w:rPr>
-          <w:rFonts w:ascii="Google Sans" w:eastAsia="Google Sans" w:hAnsi="Google Sans" w:cs="Google Sans"/>
-          <w:color w:val="1F1F1F"/>
-        </w:rPr>
-        <w:t xml:space="preserve"> Humayun Bilal (23i-0832), M. Faheem (23i-0728)</w:t>
+        </w:rPr>
+      </w:pPr>
+      <w:r>
+        <w:rPr>
+          <w:rFonts w:ascii="Google Sans" w:eastAsia="Google Sans" w:hAnsi="Google Sans" w:cs="Google Sans"/>
+          <w:b/>
+          <w:bCs/>
+        </w:rPr>
+        <w:t>Prepared by:</w:t>
       </w:r>
     </w:p>
     <w:p>
@@ -60,44 +52,17 @@
           <w:right w:val="nil"/>
           <w:between w:val="nil"/>
         </w:pBdr>
-        <w:spacing w:after="240" w:line="275" w:lineRule="auto"/>
-        <w:rPr>
-          <w:rFonts w:ascii="Google Sans" w:eastAsia="Google Sans" w:hAnsi="Google Sans" w:cs="Google Sans"/>
-          <w:color w:val="1F1F1F"/>
-        </w:rPr>
-      </w:pPr>
-      <w:r>
-        <w:rPr>
-          <w:rFonts w:ascii="Google Sans" w:eastAsia="Google Sans" w:hAnsi="Google Sans" w:cs="Google Sans"/>
-          <w:b/>
-          <w:bCs/>
-          <w:color w:val="1F1F1F"/>
-        </w:rPr>
-        <w:t>Section:</w:t>
-      </w:r>
-      <w:r>
-        <w:rPr>
-          <w:rFonts w:ascii="Google Sans" w:eastAsia="Google Sans" w:hAnsi="Google Sans" w:cs="Google Sans"/>
-          <w:color w:val="1F1F1F"/>
-        </w:rPr>
-        <w:t xml:space="preserve"> CS-D</w:t>
-      </w:r>
-    </w:p>
-    <w:p>
-      <w:pPr>
-        <w:pStyle w:val="Heading2"/>
-        <w:spacing w:before="0" w:after="120" w:line="275" w:lineRule="auto"/>
-        <w:rPr>
-          <w:rFonts w:ascii="Google Sans" w:eastAsia="Google Sans" w:hAnsi="Google Sans" w:cs="Google Sans"/>
-          <w:color w:val="1F1F1F"/>
-        </w:rPr>
-      </w:pPr>
-      <w:r>
-        <w:rPr>
-          <w:rFonts w:ascii="Google Sans" w:eastAsia="Google Sans" w:hAnsi="Google Sans" w:cs="Google Sans"/>
-          <w:color w:val="1F1F1F"/>
-        </w:rPr>
-        <w:t>1. Abstract</w:t>
+        <w:spacing w:line="300" w:lineRule="auto"/>
+        <w:jc w:val="center"/>
+        <w:rPr>
+          <w:rFonts w:ascii="Google Sans" w:eastAsia="Google Sans" w:hAnsi="Google Sans" w:cs="Google Sans"/>
+        </w:rPr>
+      </w:pPr>
+      <w:r>
+        <w:rPr>
+          <w:rFonts w:ascii="Google Sans" w:eastAsia="Google Sans" w:hAnsi="Google Sans" w:cs="Google Sans"/>
+        </w:rPr>
+        <w:t>Humayun Bilal (23i-0832)</w:t>
       </w:r>
     </w:p>
     <w:p>
@@ -109,100 +74,17 @@
           <w:right w:val="nil"/>
           <w:between w:val="nil"/>
         </w:pBdr>
-        <w:spacing w:after="240" w:line="275" w:lineRule="auto"/>
-        <w:rPr>
-          <w:rFonts w:ascii="Google Sans" w:eastAsia="Google Sans" w:hAnsi="Google Sans" w:cs="Google Sans"/>
-          <w:color w:val="1F1F1F"/>
-        </w:rPr>
-      </w:pPr>
-      <w:r>
-        <w:rPr>
-          <w:rFonts w:ascii="Google Sans" w:eastAsia="Google Sans" w:hAnsi="Google Sans" w:cs="Google Sans"/>
-          <w:color w:val="1F1F1F"/>
-        </w:rPr>
-        <w:t xml:space="preserve">This project implements an end-to-end Intelligent Reading Comprehension (RC) system using the </w:t>
-      </w:r>
-      <w:r>
-        <w:rPr>
-          <w:rFonts w:ascii="Google Sans" w:eastAsia="Google Sans" w:hAnsi="Google Sans" w:cs="Google Sans"/>
-          <w:b/>
-          <w:bCs/>
-          <w:color w:val="1F1F1F"/>
-        </w:rPr>
-        <w:t>RACE dataset</w:t>
-      </w:r>
-      <w:r>
-        <w:rPr>
-          <w:rFonts w:ascii="Google Sans" w:eastAsia="Google Sans" w:hAnsi="Google Sans" w:cs="Google Sans"/>
-          <w:color w:val="1F1F1F"/>
-        </w:rPr>
-        <w:t xml:space="preserve">. The architecture includes two primary components: </w:t>
-      </w:r>
-      <w:r>
-        <w:rPr>
-          <w:rFonts w:ascii="Google Sans" w:eastAsia="Google Sans" w:hAnsi="Google Sans" w:cs="Google Sans"/>
-          <w:b/>
-          <w:bCs/>
-          <w:color w:val="1F1F1F"/>
-        </w:rPr>
-        <w:t>Model A</w:t>
-      </w:r>
-      <w:r>
-        <w:rPr>
-          <w:rFonts w:ascii="Google Sans" w:eastAsia="Google Sans" w:hAnsi="Google Sans" w:cs="Google Sans"/>
-          <w:color w:val="1F1F1F"/>
-        </w:rPr>
-        <w:t xml:space="preserve">, a supervised binary classifier and unsupervised clustering tool optimized for large-scale answer verification, and </w:t>
-      </w:r>
-      <w:r>
-        <w:rPr>
-          <w:rFonts w:ascii="Google Sans" w:eastAsia="Google Sans" w:hAnsi="Google Sans" w:cs="Google Sans"/>
-          <w:b/>
-          <w:bCs/>
-          <w:color w:val="1F1F1F"/>
-        </w:rPr>
-        <w:t>Model B</w:t>
-      </w:r>
-      <w:r>
-        <w:rPr>
-          <w:rFonts w:ascii="Google Sans" w:eastAsia="Google Sans" w:hAnsi="Google Sans" w:cs="Google Sans"/>
-          <w:color w:val="1F1F1F"/>
-        </w:rPr>
-        <w:t>, an information retrieval system for generating plausible distractors and graduated hints. By prioritizing efficient numerical engineering (TF-IDF) over brute-force deep learning, the system achieves sub-second inference and completes training on the full 87k+ article dataset in minutes on standard hardware.</w:t>
-      </w:r>
-    </w:p>
-    <w:p>
-      <w:pPr>
-        <w:pStyle w:val="Heading2"/>
-        <w:spacing w:before="0" w:after="120" w:line="275" w:lineRule="auto"/>
-        <w:rPr>
-          <w:rFonts w:ascii="Google Sans" w:eastAsia="Google Sans" w:hAnsi="Google Sans" w:cs="Google Sans"/>
-          <w:color w:val="1F1F1F"/>
-        </w:rPr>
-      </w:pPr>
-      <w:r>
-        <w:rPr>
-          <w:rFonts w:ascii="Google Sans" w:eastAsia="Google Sans" w:hAnsi="Google Sans" w:cs="Google Sans"/>
-          <w:color w:val="1F1F1F"/>
-        </w:rPr>
-        <w:t>2. Methodology</w:t>
-      </w:r>
-    </w:p>
-    <w:p>
-      <w:pPr>
-        <w:pStyle w:val="Heading3"/>
-        <w:spacing w:before="0" w:after="120" w:line="275" w:lineRule="auto"/>
-        <w:rPr>
-          <w:rFonts w:ascii="Google Sans" w:eastAsia="Google Sans" w:hAnsi="Google Sans" w:cs="Google Sans"/>
-          <w:color w:val="1F1F1F"/>
-        </w:rPr>
-      </w:pPr>
-      <w:r>
-        <w:rPr>
-          <w:rFonts w:ascii="Google Sans" w:eastAsia="Google Sans" w:hAnsi="Google Sans" w:cs="Google Sans"/>
-          <w:color w:val="1F1F1F"/>
-        </w:rPr>
-        <w:t>2.1 Data Management &amp; Scaling</w:t>
+        <w:spacing w:line="300" w:lineRule="auto"/>
+        <w:jc w:val="center"/>
+        <w:rPr>
+          <w:rFonts w:ascii="Google Sans" w:eastAsia="Google Sans" w:hAnsi="Google Sans" w:cs="Google Sans"/>
+        </w:rPr>
+      </w:pPr>
+      <w:r>
+        <w:rPr>
+          <w:rFonts w:ascii="Google Sans" w:eastAsia="Google Sans" w:hAnsi="Google Sans" w:cs="Google Sans"/>
+        </w:rPr>
+        <w:t>M. Faheem (23i-0728)</w:t>
       </w:r>
     </w:p>
     <w:p>
@@ -214,34 +96,99 @@
           <w:right w:val="nil"/>
           <w:between w:val="nil"/>
         </w:pBdr>
-        <w:spacing w:after="120" w:line="275" w:lineRule="auto"/>
-        <w:rPr>
-          <w:rFonts w:ascii="Google Sans" w:eastAsia="Google Sans" w:hAnsi="Google Sans" w:cs="Google Sans"/>
-          <w:color w:val="1F1F1F"/>
-        </w:rPr>
-      </w:pPr>
-      <w:r>
-        <w:rPr>
-          <w:rFonts w:ascii="Google Sans" w:eastAsia="Google Sans" w:hAnsi="Google Sans" w:cs="Google Sans"/>
-          <w:color w:val="1F1F1F"/>
-        </w:rPr>
-        <w:t xml:space="preserve">Unlike baseline implementations that use small samples, this system processes the </w:t>
-      </w:r>
-      <w:r>
-        <w:rPr>
-          <w:rFonts w:ascii="Google Sans" w:eastAsia="Google Sans" w:hAnsi="Google Sans" w:cs="Google Sans"/>
-          <w:b/>
-          <w:bCs/>
-          <w:color w:val="1F1F1F"/>
-        </w:rPr>
-        <w:t>full RACE training set</w:t>
-      </w:r>
-      <w:r>
-        <w:rPr>
-          <w:rFonts w:ascii="Google Sans" w:eastAsia="Google Sans" w:hAnsi="Google Sans" w:cs="Google Sans"/>
-          <w:color w:val="1F1F1F"/>
-        </w:rPr>
-        <w:t xml:space="preserve"> (~87,866 questions).</w:t>
+        <w:spacing w:after="450" w:line="300" w:lineRule="auto"/>
+        <w:jc w:val="center"/>
+        <w:rPr>
+          <w:rFonts w:ascii="Google Sans" w:eastAsia="Google Sans" w:hAnsi="Google Sans" w:cs="Google Sans"/>
+        </w:rPr>
+      </w:pPr>
+      <w:r>
+        <w:rPr>
+          <w:rFonts w:ascii="Google Sans" w:eastAsia="Google Sans" w:hAnsi="Google Sans" w:cs="Google Sans"/>
+        </w:rPr>
+        <w:t>Section: CS-D</w:t>
+      </w:r>
+    </w:p>
+    <w:p>
+      <w:pPr>
+        <w:pStyle w:val="Heading2"/>
+        <w:spacing w:before="0" w:after="300"/>
+        <w:rPr>
+          <w:rFonts w:ascii="Google Sans" w:eastAsia="Google Sans" w:hAnsi="Google Sans" w:cs="Google Sans"/>
+        </w:rPr>
+      </w:pPr>
+      <w:r>
+        <w:rPr>
+          <w:rFonts w:ascii="Google Sans" w:eastAsia="Google Sans" w:hAnsi="Google Sans" w:cs="Google Sans"/>
+        </w:rPr>
+        <w:t>1. Abstract</w:t>
+      </w:r>
+    </w:p>
+    <w:p>
+      <w:pPr>
+        <w:pBdr>
+          <w:top w:val="nil"/>
+          <w:left w:val="nil"/>
+          <w:bottom w:val="nil"/>
+          <w:right w:val="nil"/>
+          <w:between w:val="nil"/>
+        </w:pBdr>
+        <w:spacing w:after="450" w:line="300" w:lineRule="auto"/>
+        <w:rPr>
+          <w:rFonts w:ascii="Google Sans" w:eastAsia="Google Sans" w:hAnsi="Google Sans" w:cs="Google Sans"/>
+        </w:rPr>
+      </w:pPr>
+      <w:r>
+        <w:pict w14:anchorId="370F7365">
+          <v:rect id="_x0000_i1025" style="width:0;height:1.5pt" o:hralign="center" o:hrstd="t" o:hr="t" fillcolor="#a0a0a0" stroked="f"/>
+        </w:pict>
+      </w:r>
+      <w:r>
+        <w:rPr>
+          <w:rFonts w:ascii="Google Sans" w:eastAsia="Google Sans" w:hAnsi="Google Sans" w:cs="Google Sans"/>
+        </w:rPr>
+        <w:t>This project presents the development of an end-to-end Intelligent Reading Comprehension (RC) and verification system utilizing the RACE dataset. The architecture leverages traditional machine learning and Information Retrieval (IR) techniques to provide a low-latency, resource-efficient solution for educational quiz generation. Model A focuses on answer verification via supervised binary classification, while Model B handles the extractive generation of distractors and graduated hints. Trained on a full-scale dataset of 351,464 labels, the system achieves a balanced F1-score of 0.60 and sub-second inference times, meeting strict hardware and performance constraints.</w:t>
+      </w:r>
+    </w:p>
+    <w:p>
+      <w:pPr>
+        <w:pStyle w:val="Heading2"/>
+        <w:spacing w:before="0" w:after="300"/>
+        <w:rPr>
+          <w:rFonts w:ascii="Google Sans" w:eastAsia="Google Sans" w:hAnsi="Google Sans" w:cs="Google Sans"/>
+        </w:rPr>
+      </w:pPr>
+      <w:r>
+        <w:rPr>
+          <w:rFonts w:ascii="Google Sans" w:eastAsia="Google Sans" w:hAnsi="Google Sans" w:cs="Google Sans"/>
+        </w:rPr>
+        <w:t>2. Introduction and Objectives</w:t>
+      </w:r>
+    </w:p>
+    <w:p>
+      <w:pPr>
+        <w:pBdr>
+          <w:top w:val="nil"/>
+          <w:left w:val="nil"/>
+          <w:bottom w:val="nil"/>
+          <w:right w:val="nil"/>
+          <w:between w:val="nil"/>
+        </w:pBdr>
+        <w:spacing w:line="300" w:lineRule="auto"/>
+        <w:rPr>
+          <w:rFonts w:ascii="Google Sans" w:eastAsia="Google Sans" w:hAnsi="Google Sans" w:cs="Google Sans"/>
+        </w:rPr>
+      </w:pPr>
+      <w:r>
+        <w:pict w14:anchorId="66CAC421">
+          <v:rect id="_x0000_i1026" style="width:0;height:1.5pt" o:hralign="center" o:hrstd="t" o:hr="t" fillcolor="#a0a0a0" stroked="f"/>
+        </w:pict>
+      </w:r>
+      <w:r>
+        <w:rPr>
+          <w:rFonts w:ascii="Google Sans" w:eastAsia="Google Sans" w:hAnsi="Google Sans" w:cs="Google Sans"/>
+        </w:rPr>
+        <w:t>The primary objective of this project is to automate the evaluation and pedagogical support of reading comprehension tasks. Unlike generative large language models, this system prioritizes interpretability and computational efficiency.</w:t>
       </w:r>
     </w:p>
     <w:p>
@@ -257,39 +204,21 @@
           <w:right w:val="nil"/>
           <w:between w:val="nil"/>
         </w:pBdr>
-        <w:spacing w:line="275" w:lineRule="auto"/>
+        <w:spacing w:line="300" w:lineRule="auto"/>
       </w:pPr>
       <w:r>
         <w:rPr>
           <w:rFonts w:ascii="Google Sans" w:eastAsia="Google Sans" w:hAnsi="Google Sans" w:cs="Google Sans"/>
           <w:b/>
           <w:bCs/>
-          <w:color w:val="1F1F1F"/>
-        </w:rPr>
-        <w:t>Expansion:</w:t>
-      </w:r>
-      <w:r>
-        <w:rPr>
-          <w:rFonts w:ascii="Google Sans" w:eastAsia="Google Sans" w:hAnsi="Google Sans" w:cs="Google Sans"/>
-          <w:color w:val="1F1F1F"/>
-        </w:rPr>
-        <w:t xml:space="preserve"> Each question was expanded into its four constituent options (A, B, C, D), resulting in </w:t>
-      </w:r>
-      <w:r>
-        <w:rPr>
-          <w:rFonts w:ascii="Google Sans" w:eastAsia="Google Sans" w:hAnsi="Google Sans" w:cs="Google Sans"/>
-          <w:b/>
-          <w:bCs/>
-          <w:color w:val="1F1F1F"/>
-        </w:rPr>
-        <w:t>351,464 individual labels</w:t>
-      </w:r>
-      <w:r>
-        <w:rPr>
-          <w:rFonts w:ascii="Google Sans" w:eastAsia="Google Sans" w:hAnsi="Google Sans" w:cs="Google Sans"/>
-          <w:color w:val="1F1F1F"/>
-        </w:rPr>
-        <w:t xml:space="preserve"> for the verification task.</w:t>
+        </w:rPr>
+        <w:t>Automated Verification:</w:t>
+      </w:r>
+      <w:r>
+        <w:rPr>
+          <w:rFonts w:ascii="Google Sans" w:eastAsia="Google Sans" w:hAnsi="Google Sans" w:cs="Google Sans"/>
+        </w:rPr>
+        <w:t xml:space="preserve"> Determining the mathematical and semantic validity of multiple-choice options.</w:t>
       </w:r>
     </w:p>
     <w:p>
@@ -305,23 +234,21 @@
           <w:right w:val="nil"/>
           <w:between w:val="nil"/>
         </w:pBdr>
-        <w:spacing w:line="275" w:lineRule="auto"/>
+        <w:spacing w:line="300" w:lineRule="auto"/>
       </w:pPr>
       <w:r>
         <w:rPr>
           <w:rFonts w:ascii="Google Sans" w:eastAsia="Google Sans" w:hAnsi="Google Sans" w:cs="Google Sans"/>
           <w:b/>
           <w:bCs/>
-          <w:color w:val="1F1F1F"/>
-        </w:rPr>
-        <w:t>Manual Split (80-10-10):</w:t>
-      </w:r>
-      <w:r>
-        <w:rPr>
-          <w:rFonts w:ascii="Google Sans" w:eastAsia="Google Sans" w:hAnsi="Google Sans" w:cs="Google Sans"/>
-          <w:color w:val="1F1F1F"/>
-        </w:rPr>
-        <w:t xml:space="preserve"> The dataset was partitioned into Training (281,171), Validation (35,146), and Testing (35,147) sets using stratified sampling to maintain class distribution.</w:t>
+        </w:rPr>
+        <w:t>Distractor Generation:</w:t>
+      </w:r>
+      <w:r>
+        <w:rPr>
+          <w:rFonts w:ascii="Google Sans" w:eastAsia="Google Sans" w:hAnsi="Google Sans" w:cs="Google Sans"/>
+        </w:rPr>
+        <w:t xml:space="preserve"> Extracting plausible yet incorrect sentences from the source text to challenge users.</w:t>
       </w:r>
     </w:p>
     <w:p>
@@ -337,59 +264,165 @@
           <w:right w:val="nil"/>
           <w:between w:val="nil"/>
         </w:pBdr>
-        <w:spacing w:after="120" w:line="275" w:lineRule="auto"/>
+        <w:spacing w:line="300" w:lineRule="auto"/>
       </w:pPr>
       <w:r>
         <w:rPr>
           <w:rFonts w:ascii="Google Sans" w:eastAsia="Google Sans" w:hAnsi="Google Sans" w:cs="Google Sans"/>
           <w:b/>
           <w:bCs/>
-          <w:color w:val="1F1F1F"/>
-        </w:rPr>
-        <w:t>Class Imbalance:</w:t>
-      </w:r>
-      <w:r>
-        <w:rPr>
-          <w:rFonts w:ascii="Google Sans" w:eastAsia="Google Sans" w:hAnsi="Google Sans" w:cs="Google Sans"/>
-          <w:color w:val="1F1F1F"/>
-        </w:rPr>
-        <w:t xml:space="preserve"> The data presents a natural 3:1 imbalance (75% incorrect, 25% correct). This was addressed using </w:t>
+        </w:rPr>
+        <w:t>Graduated Scaffolding:</w:t>
+      </w:r>
+      <w:r>
+        <w:rPr>
+          <w:rFonts w:ascii="Google Sans" w:eastAsia="Google Sans" w:hAnsi="Google Sans" w:cs="Google Sans"/>
+        </w:rPr>
+        <w:t xml:space="preserve"> Implementing a three-stage hint system to guide users toward correct evidence.</w:t>
+      </w:r>
+    </w:p>
+    <w:p>
+      <w:pPr>
+        <w:numPr>
+          <w:ilvl w:val="0"/>
+          <w:numId w:val="1"/>
+        </w:numPr>
+        <w:pBdr>
+          <w:top w:val="nil"/>
+          <w:left w:val="nil"/>
+          <w:bottom w:val="nil"/>
+          <w:right w:val="nil"/>
+          <w:between w:val="nil"/>
+        </w:pBdr>
+        <w:spacing w:line="300" w:lineRule="auto"/>
+      </w:pPr>
+      <w:r>
+        <w:rPr>
+          <w:rFonts w:ascii="Google Sans" w:eastAsia="Google Sans" w:hAnsi="Google Sans" w:cs="Google Sans"/>
+          <w:b/>
+          <w:bCs/>
+        </w:rPr>
+        <w:t>Hardware Optimization:</w:t>
+      </w:r>
+      <w:r>
+        <w:rPr>
+          <w:rFonts w:ascii="Google Sans" w:eastAsia="Google Sans" w:hAnsi="Google Sans" w:cs="Google Sans"/>
+        </w:rPr>
+        <w:t xml:space="preserve"> Ensuring high performance on consumer grade hardware without the need of a </w:t>
+      </w:r>
+      <w:proofErr w:type="gramStart"/>
+      <w:r>
+        <w:rPr>
+          <w:rFonts w:ascii="Google Sans" w:eastAsia="Google Sans" w:hAnsi="Google Sans" w:cs="Google Sans"/>
+        </w:rPr>
+        <w:t>GPU..</w:t>
+      </w:r>
+      <w:proofErr w:type="gramEnd"/>
+    </w:p>
+    <w:p>
+      <w:pPr>
+        <w:pStyle w:val="Heading2"/>
+        <w:spacing w:before="450" w:after="315"/>
+        <w:rPr>
+          <w:rFonts w:ascii="Google Sans" w:eastAsia="Google Sans" w:hAnsi="Google Sans" w:cs="Google Sans"/>
+        </w:rPr>
+      </w:pPr>
+      <w:r>
+        <w:rPr>
+          <w:rFonts w:ascii="Google Sans" w:eastAsia="Google Sans" w:hAnsi="Google Sans" w:cs="Google Sans"/>
+        </w:rPr>
+        <w:lastRenderedPageBreak/>
+        <w:t>3. Methodology</w:t>
+      </w:r>
+    </w:p>
+    <w:p>
+      <w:pPr>
+        <w:pStyle w:val="Heading3"/>
+        <w:spacing w:before="0"/>
+        <w:rPr>
+          <w:rFonts w:ascii="Google Sans" w:eastAsia="Google Sans" w:hAnsi="Google Sans" w:cs="Google Sans"/>
+        </w:rPr>
+      </w:pPr>
+      <w:r>
+        <w:pict w14:anchorId="0BD3090C">
+          <v:rect id="_x0000_i1027" style="width:0;height:1.5pt" o:hralign="center" o:hrstd="t" o:hr="t" fillcolor="#a0a0a0" stroked="f"/>
+        </w:pict>
+      </w:r>
+      <w:r>
+        <w:rPr>
+          <w:rFonts w:ascii="Google Sans" w:eastAsia="Google Sans" w:hAnsi="Google Sans" w:cs="Google Sans"/>
+        </w:rPr>
+        <w:t>3.1 Dataset: RACE</w:t>
+      </w:r>
+    </w:p>
+    <w:p>
+      <w:pPr>
+        <w:pBdr>
+          <w:top w:val="nil"/>
+          <w:left w:val="nil"/>
+          <w:bottom w:val="nil"/>
+          <w:right w:val="nil"/>
+          <w:between w:val="nil"/>
+        </w:pBdr>
+        <w:spacing w:after="240" w:line="300" w:lineRule="auto"/>
+        <w:rPr>
+          <w:rFonts w:ascii="Google Sans" w:eastAsia="Google Sans" w:hAnsi="Google Sans" w:cs="Google Sans"/>
+        </w:rPr>
+      </w:pPr>
+      <w:r>
+        <w:rPr>
+          <w:rFonts w:ascii="Google Sans" w:eastAsia="Google Sans" w:hAnsi="Google Sans" w:cs="Google Sans"/>
+        </w:rPr>
+        <w:t xml:space="preserve">The system utilizes the </w:t>
       </w:r>
       <w:proofErr w:type="spellStart"/>
       <w:r>
         <w:rPr>
           <w:rFonts w:ascii="Google Sans" w:eastAsia="Google Sans" w:hAnsi="Google Sans" w:cs="Google Sans"/>
-          <w:color w:val="1F1F1F"/>
-        </w:rPr>
-        <w:t>class_weight</w:t>
+          <w:b/>
+          <w:bCs/>
+        </w:rPr>
+        <w:t>ReAdability</w:t>
       </w:r>
       <w:proofErr w:type="spellEnd"/>
       <w:r>
         <w:rPr>
           <w:rFonts w:ascii="Google Sans" w:eastAsia="Google Sans" w:hAnsi="Google Sans" w:cs="Google Sans"/>
-          <w:color w:val="1F1F1F"/>
-        </w:rPr>
-        <w:t>='balanced' to prevent the "75% Accuracy Trap."</w:t>
-      </w:r>
-    </w:p>
-    <w:p>
-      <w:pPr>
-        <w:pStyle w:val="Heading3"/>
-        <w:spacing w:after="120" w:line="275" w:lineRule="auto"/>
-        <w:rPr>
-          <w:rFonts w:ascii="Google Sans" w:eastAsia="Google Sans" w:hAnsi="Google Sans" w:cs="Google Sans"/>
-          <w:color w:val="1F1F1F"/>
-        </w:rPr>
-      </w:pPr>
-      <w:r>
-        <w:rPr>
-          <w:noProof/>
+          <w:b/>
+          <w:bCs/>
+        </w:rPr>
+        <w:t xml:space="preserve"> Dataset for Comprehension Evaluation (RACE)</w:t>
+      </w:r>
+      <w:r>
+        <w:rPr>
+          <w:rFonts w:ascii="Google Sans" w:eastAsia="Google Sans" w:hAnsi="Google Sans" w:cs="Google Sans"/>
+        </w:rPr>
+        <w:t>. For Model A, the data was expanded from its original four-option format into a binary dataset where each triplet (Passage, Question, Option) is assigned a label of 1 (Correct) or 0 (Incorrect). This expansion resulted in a total of 351,464 individual labels for training and evaluation.</w:t>
+      </w:r>
+    </w:p>
+    <w:p>
+      <w:pPr>
+        <w:pBdr>
+          <w:top w:val="nil"/>
+          <w:left w:val="nil"/>
+          <w:bottom w:val="nil"/>
+          <w:right w:val="nil"/>
+          <w:between w:val="nil"/>
+        </w:pBdr>
+        <w:spacing w:after="240" w:line="300" w:lineRule="auto"/>
+        <w:rPr>
+          <w:rFonts w:ascii="Google Sans" w:eastAsia="Google Sans" w:hAnsi="Google Sans" w:cs="Google Sans"/>
+        </w:rPr>
+      </w:pPr>
+      <w:r>
+        <w:rPr>
+          <w:rFonts w:ascii="Google Sans" w:eastAsia="Google Sans" w:hAnsi="Google Sans" w:cs="Google Sans"/>
         </w:rPr>
         <w:drawing>
-          <wp:inline distT="0" distB="0" distL="0" distR="0" wp14:anchorId="2AF38F03" wp14:editId="0637D2CC">
-            <wp:extent cx="3266878" cy="1959429"/>
-            <wp:effectExtent l="0" t="0" r="0" b="3175"/>
-            <wp:docPr id="303491783" name="Picture 1"/>
+          <wp:inline distT="0" distB="0" distL="0" distR="0" wp14:anchorId="6C7BF6FF" wp14:editId="6ABF9343">
+            <wp:extent cx="5430008" cy="857370"/>
+            <wp:effectExtent l="0" t="0" r="0" b="0"/>
+            <wp:docPr id="1458719619" name="Picture 1"/>
             <wp:cNvGraphicFramePr>
               <a:graphicFrameLocks xmlns:a="http://schemas.openxmlformats.org/drawingml/2006/main" noChangeAspect="1"/>
             </wp:cNvGraphicFramePr>
@@ -397,36 +430,23 @@
               <a:graphicData uri="http://schemas.openxmlformats.org/drawingml/2006/picture">
                 <pic:pic xmlns:pic="http://schemas.openxmlformats.org/drawingml/2006/picture">
                   <pic:nvPicPr>
-                    <pic:cNvPr id="0" name="Picture 1"/>
-                    <pic:cNvPicPr>
-                      <a:picLocks noChangeAspect="1" noChangeArrowheads="1"/>
-                    </pic:cNvPicPr>
+                    <pic:cNvPr id="1458719619" name=""/>
+                    <pic:cNvPicPr/>
                   </pic:nvPicPr>
                   <pic:blipFill>
-                    <a:blip r:embed="rId5" cstate="print">
-                      <a:extLst>
-                        <a:ext uri="{28A0092B-C50C-407E-A947-70E740481C1C}">
-                          <a14:useLocalDpi xmlns:a14="http://schemas.microsoft.com/office/drawing/2010/main" val="0"/>
-                        </a:ext>
-                      </a:extLst>
-                    </a:blip>
-                    <a:srcRect/>
+                    <a:blip r:embed="rId5"/>
                     <a:stretch>
                       <a:fillRect/>
                     </a:stretch>
                   </pic:blipFill>
-                  <pic:spPr bwMode="auto">
+                  <pic:spPr>
                     <a:xfrm>
                       <a:off x="0" y="0"/>
-                      <a:ext cx="3276525" cy="1965215"/>
+                      <a:ext cx="5430008" cy="857370"/>
                     </a:xfrm>
                     <a:prstGeom prst="rect">
                       <a:avLst/>
                     </a:prstGeom>
-                    <a:noFill/>
-                    <a:ln>
-                      <a:noFill/>
-                    </a:ln>
                   </pic:spPr>
                 </pic:pic>
               </a:graphicData>
@@ -438,19 +458,16 @@
     <w:p>
       <w:pPr>
         <w:pStyle w:val="Heading3"/>
-        <w:spacing w:after="120" w:line="275" w:lineRule="auto"/>
-        <w:rPr>
-          <w:rFonts w:ascii="Google Sans" w:eastAsia="Google Sans" w:hAnsi="Google Sans" w:cs="Google Sans"/>
-          <w:color w:val="1F1F1F"/>
-        </w:rPr>
-      </w:pPr>
-      <w:r>
-        <w:rPr>
-          <w:rFonts w:ascii="Google Sans" w:eastAsia="Google Sans" w:hAnsi="Google Sans" w:cs="Google Sans"/>
-          <w:color w:val="1F1F1F"/>
-        </w:rPr>
-        <w:lastRenderedPageBreak/>
-        <w:t>2.2 Feature Engineering (Optimized TF-IDF)</w:t>
+        <w:spacing w:before="0"/>
+        <w:rPr>
+          <w:rFonts w:ascii="Google Sans" w:eastAsia="Google Sans" w:hAnsi="Google Sans" w:cs="Google Sans"/>
+        </w:rPr>
+      </w:pPr>
+      <w:r>
+        <w:rPr>
+          <w:rFonts w:ascii="Google Sans" w:eastAsia="Google Sans" w:hAnsi="Google Sans" w:cs="Google Sans"/>
+        </w:rPr>
+        <w:t>3.2 Feature Engineering</w:t>
       </w:r>
     </w:p>
     <w:p>
@@ -462,18 +479,16 @@
           <w:right w:val="nil"/>
           <w:between w:val="nil"/>
         </w:pBdr>
-        <w:spacing w:after="120" w:line="275" w:lineRule="auto"/>
-        <w:rPr>
-          <w:rFonts w:ascii="Google Sans" w:eastAsia="Google Sans" w:hAnsi="Google Sans" w:cs="Google Sans"/>
-          <w:color w:val="1F1F1F"/>
-        </w:rPr>
-      </w:pPr>
-      <w:r>
-        <w:rPr>
-          <w:rFonts w:ascii="Google Sans" w:eastAsia="Google Sans" w:hAnsi="Google Sans" w:cs="Google Sans"/>
-          <w:color w:val="1F1F1F"/>
-        </w:rPr>
-        <w:t>To maximize the 32GB RAM and Ryzen 5600X CPU, we implemented an optimized NLP pipeline:</w:t>
+        <w:spacing w:line="300" w:lineRule="auto"/>
+        <w:rPr>
+          <w:rFonts w:ascii="Google Sans" w:eastAsia="Google Sans" w:hAnsi="Google Sans" w:cs="Google Sans"/>
+        </w:rPr>
+      </w:pPr>
+      <w:r>
+        <w:rPr>
+          <w:rFonts w:ascii="Google Sans" w:eastAsia="Google Sans" w:hAnsi="Google Sans" w:cs="Google Sans"/>
+        </w:rPr>
+        <w:t>Textual data was processed through an NLP pipeline including:</w:t>
       </w:r>
     </w:p>
     <w:p>
@@ -489,29 +504,26 @@
           <w:right w:val="nil"/>
           <w:between w:val="nil"/>
         </w:pBdr>
-        <w:spacing w:line="275" w:lineRule="auto"/>
+        <w:spacing w:line="300" w:lineRule="auto"/>
       </w:pPr>
       <w:r>
         <w:rPr>
           <w:rFonts w:ascii="Google Sans" w:eastAsia="Google Sans" w:hAnsi="Google Sans" w:cs="Google Sans"/>
           <w:b/>
           <w:bCs/>
-          <w:color w:val="1F1F1F"/>
         </w:rPr>
         <w:t>Lemmatization:</w:t>
       </w:r>
       <w:r>
         <w:rPr>
           <w:rFonts w:ascii="Google Sans" w:eastAsia="Google Sans" w:hAnsi="Google Sans" w:cs="Google Sans"/>
-          <w:color w:val="1F1F1F"/>
-        </w:rPr>
-        <w:t xml:space="preserve"> Used NLTK’s </w:t>
+        </w:rPr>
+        <w:t xml:space="preserve"> Reducing word variations to their root forms using the </w:t>
       </w:r>
       <w:proofErr w:type="spellStart"/>
       <w:r>
         <w:rPr>
           <w:rFonts w:ascii="Google Sans" w:eastAsia="Google Sans" w:hAnsi="Google Sans" w:cs="Google Sans"/>
-          <w:color w:val="1F1F1F"/>
         </w:rPr>
         <w:t>WordNetLemmatizer</w:t>
       </w:r>
@@ -519,9 +531,8 @@
       <w:r>
         <w:rPr>
           <w:rFonts w:ascii="Google Sans" w:eastAsia="Google Sans" w:hAnsi="Google Sans" w:cs="Google Sans"/>
-          <w:color w:val="1F1F1F"/>
-        </w:rPr>
-        <w:t xml:space="preserve"> to reduce lexical sparsity (e.g., matching "walked" to "walk").</w:t>
+        </w:rPr>
+        <w:t xml:space="preserve"> to handle lexical sparsity.</w:t>
       </w:r>
     </w:p>
     <w:p>
@@ -537,23 +548,21 @@
           <w:right w:val="nil"/>
           <w:between w:val="nil"/>
         </w:pBdr>
-        <w:spacing w:line="275" w:lineRule="auto"/>
+        <w:spacing w:line="300" w:lineRule="auto"/>
       </w:pPr>
       <w:r>
         <w:rPr>
           <w:rFonts w:ascii="Google Sans" w:eastAsia="Google Sans" w:hAnsi="Google Sans" w:cs="Google Sans"/>
           <w:b/>
           <w:bCs/>
-          <w:color w:val="1F1F1F"/>
-        </w:rPr>
-        <w:t>N-gram Expansion (1, 2):</w:t>
-      </w:r>
-      <w:r>
-        <w:rPr>
-          <w:rFonts w:ascii="Google Sans" w:eastAsia="Google Sans" w:hAnsi="Google Sans" w:cs="Google Sans"/>
-          <w:color w:val="1F1F1F"/>
-        </w:rPr>
-        <w:t xml:space="preserve"> Captured contextual phrases (e.g., "climate change") which significantly improved retrieval relevance.</w:t>
+        </w:rPr>
+        <w:t>TF-IDF Vectorization:</w:t>
+      </w:r>
+      <w:r>
+        <w:rPr>
+          <w:rFonts w:ascii="Google Sans" w:eastAsia="Google Sans" w:hAnsi="Google Sans" w:cs="Google Sans"/>
+        </w:rPr>
+        <w:t xml:space="preserve"> Converting text into a 30,000-dimensional sparse matrix, utilizing bigrams to capture phrasal context.</w:t>
       </w:r>
     </w:p>
     <w:p>
@@ -569,72 +578,56 @@
           <w:right w:val="nil"/>
           <w:between w:val="nil"/>
         </w:pBdr>
-        <w:spacing w:after="120" w:line="275" w:lineRule="auto"/>
+        <w:spacing w:line="300" w:lineRule="auto"/>
       </w:pPr>
       <w:r>
         <w:rPr>
           <w:rFonts w:ascii="Google Sans" w:eastAsia="Google Sans" w:hAnsi="Google Sans" w:cs="Google Sans"/>
           <w:b/>
           <w:bCs/>
-          <w:color w:val="1F1F1F"/>
-        </w:rPr>
-        <w:t>Vectorization:</w:t>
-      </w:r>
-      <w:r>
-        <w:rPr>
-          <w:rFonts w:ascii="Google Sans" w:eastAsia="Google Sans" w:hAnsi="Google Sans" w:cs="Google Sans"/>
-          <w:color w:val="1F1F1F"/>
-        </w:rPr>
-        <w:t xml:space="preserve"> A sparse matrix of </w:t>
-      </w:r>
-      <w:r>
-        <w:rPr>
-          <w:rFonts w:ascii="Google Sans" w:eastAsia="Google Sans" w:hAnsi="Google Sans" w:cs="Google Sans"/>
-          <w:b/>
-          <w:bCs/>
-          <w:color w:val="1F1F1F"/>
-        </w:rPr>
-        <w:t>25,000 to 30,000 features</w:t>
-      </w:r>
-      <w:r>
-        <w:rPr>
-          <w:rFonts w:ascii="Google Sans" w:eastAsia="Google Sans" w:hAnsi="Google Sans" w:cs="Google Sans"/>
-          <w:color w:val="1F1F1F"/>
-        </w:rPr>
-        <w:t xml:space="preserve"> was used, filtering out low-frequency noise with </w:t>
-      </w:r>
-      <w:proofErr w:type="spellStart"/>
-      <w:r>
-        <w:rPr>
-          <w:rFonts w:ascii="Google Sans" w:eastAsia="Google Sans" w:hAnsi="Google Sans" w:cs="Google Sans"/>
-          <w:color w:val="1F1F1F"/>
-        </w:rPr>
-        <w:t>min_df</w:t>
-      </w:r>
-      <w:proofErr w:type="spellEnd"/>
-      <w:r>
-        <w:rPr>
-          <w:rFonts w:ascii="Google Sans" w:eastAsia="Google Sans" w:hAnsi="Google Sans" w:cs="Google Sans"/>
-          <w:color w:val="1F1F1F"/>
-        </w:rPr>
-        <w:t>=5.</w:t>
+        </w:rPr>
+        <w:t>Weighted Query Expansion:</w:t>
+      </w:r>
+      <w:r>
+        <w:rPr>
+          <w:rFonts w:ascii="Google Sans" w:eastAsia="Google Sans" w:hAnsi="Google Sans" w:cs="Google Sans"/>
+        </w:rPr>
+        <w:t xml:space="preserve"> In Model B, the target answer is weighted twice during the retrieval process to ensure high-relevance hint alignment.</w:t>
+      </w:r>
+    </w:p>
+    <w:p>
+      <w:pPr>
+        <w:pStyle w:val="Heading2"/>
+        <w:spacing w:before="450" w:after="315"/>
+        <w:rPr>
+          <w:rFonts w:ascii="Google Sans" w:eastAsia="Google Sans" w:hAnsi="Google Sans" w:cs="Google Sans"/>
+        </w:rPr>
+      </w:pPr>
+      <w:r>
+        <w:rPr>
+          <w:rFonts w:ascii="Google Sans" w:eastAsia="Google Sans" w:hAnsi="Google Sans" w:cs="Google Sans"/>
+        </w:rPr>
+        <w:t>4. Implementation Details</w:t>
       </w:r>
     </w:p>
     <w:p>
       <w:pPr>
         <w:pStyle w:val="Heading3"/>
-        <w:spacing w:before="120" w:after="120" w:line="275" w:lineRule="auto"/>
-        <w:rPr>
-          <w:rFonts w:ascii="Google Sans" w:eastAsia="Google Sans" w:hAnsi="Google Sans" w:cs="Google Sans"/>
-          <w:color w:val="1F1F1F"/>
-        </w:rPr>
-      </w:pPr>
-      <w:r>
-        <w:rPr>
-          <w:rFonts w:ascii="Google Sans" w:eastAsia="Google Sans" w:hAnsi="Google Sans" w:cs="Google Sans"/>
-          <w:color w:val="1F1F1F"/>
-        </w:rPr>
-        <w:t>2.3 Model A: Supervised Verification</w:t>
+        <w:spacing w:before="0"/>
+        <w:rPr>
+          <w:rFonts w:ascii="Google Sans" w:eastAsia="Google Sans" w:hAnsi="Google Sans" w:cs="Google Sans"/>
+        </w:rPr>
+      </w:pPr>
+      <w:r>
+        <w:pict w14:anchorId="3A0EC9C8">
+          <v:rect id="_x0000_i1028" style="width:0;height:1.5pt" o:hralign="center" o:hrstd="t" o:hr="t" fillcolor="#a0a0a0" stroked="f"/>
+        </w:pict>
+      </w:r>
+      <w:r>
+        <w:rPr>
+          <w:rFonts w:ascii="Google Sans" w:eastAsia="Google Sans" w:hAnsi="Google Sans" w:cs="Google Sans"/>
+        </w:rPr>
+        <w:t>4.1 Model A: The Verifier</w:t>
       </w:r>
     </w:p>
     <w:p>
@@ -646,67 +639,59 @@
           <w:right w:val="nil"/>
           <w:between w:val="nil"/>
         </w:pBdr>
-        <w:spacing w:after="240" w:line="275" w:lineRule="auto"/>
-        <w:rPr>
-          <w:rFonts w:ascii="Google Sans" w:eastAsia="Google Sans" w:hAnsi="Google Sans" w:cs="Google Sans"/>
-          <w:color w:val="1F1F1F"/>
-        </w:rPr>
-      </w:pPr>
-      <w:r>
-        <w:rPr>
-          <w:rFonts w:ascii="Google Sans" w:eastAsia="Google Sans" w:hAnsi="Google Sans" w:cs="Google Sans"/>
-          <w:color w:val="1F1F1F"/>
-        </w:rPr>
-        <w:t xml:space="preserve">We trained </w:t>
+        <w:spacing w:after="240" w:line="300" w:lineRule="auto"/>
+        <w:rPr>
+          <w:rFonts w:ascii="Google Sans" w:eastAsia="Google Sans" w:hAnsi="Google Sans" w:cs="Google Sans"/>
+        </w:rPr>
+      </w:pPr>
+      <w:r>
+        <w:rPr>
+          <w:rFonts w:ascii="Google Sans" w:eastAsia="Google Sans" w:hAnsi="Google Sans" w:cs="Google Sans"/>
+        </w:rPr>
+        <w:t xml:space="preserve">Model A utilizes </w:t>
       </w:r>
       <w:r>
         <w:rPr>
           <w:rFonts w:ascii="Google Sans" w:eastAsia="Google Sans" w:hAnsi="Google Sans" w:cs="Google Sans"/>
           <w:b/>
           <w:bCs/>
-          <w:color w:val="1F1F1F"/>
         </w:rPr>
         <w:t>Logistic Regression</w:t>
       </w:r>
       <w:r>
         <w:rPr>
           <w:rFonts w:ascii="Google Sans" w:eastAsia="Google Sans" w:hAnsi="Google Sans" w:cs="Google Sans"/>
-          <w:color w:val="1F1F1F"/>
-        </w:rPr>
-        <w:t xml:space="preserve"> (using the saga solver for high-dimensional sparse data) and </w:t>
+        </w:rPr>
+        <w:t xml:space="preserve"> (with the SAGA solver) and </w:t>
       </w:r>
       <w:r>
         <w:rPr>
           <w:rFonts w:ascii="Google Sans" w:eastAsia="Google Sans" w:hAnsi="Google Sans" w:cs="Google Sans"/>
           <w:b/>
           <w:bCs/>
-          <w:color w:val="1F1F1F"/>
         </w:rPr>
         <w:t>Linear SVM</w:t>
       </w:r>
       <w:r>
         <w:rPr>
           <w:rFonts w:ascii="Google Sans" w:eastAsia="Google Sans" w:hAnsi="Google Sans" w:cs="Google Sans"/>
-          <w:color w:val="1F1F1F"/>
-        </w:rPr>
-        <w:t>. These models evaluate the semantic "fit" of a specific option given a passage and a query.</w:t>
+        </w:rPr>
+        <w:t xml:space="preserve"> with balanced class weights. This approach prevents the "Accuracy Trap" inherent in the 3:1 imbalanced distribution of the dataset. The models were trained on 351,464 expanded rows, ensuring robust generalization across different reading materials.</w:t>
       </w:r>
     </w:p>
     <w:p>
       <w:pPr>
         <w:pStyle w:val="Heading3"/>
-        <w:spacing w:before="0" w:after="120" w:line="275" w:lineRule="auto"/>
-        <w:rPr>
-          <w:rFonts w:ascii="Google Sans" w:eastAsia="Google Sans" w:hAnsi="Google Sans" w:cs="Google Sans"/>
-          <w:color w:val="1F1F1F"/>
-        </w:rPr>
-      </w:pPr>
-      <w:r>
-        <w:rPr>
-          <w:rFonts w:ascii="Google Sans" w:eastAsia="Google Sans" w:hAnsi="Google Sans" w:cs="Google Sans"/>
-          <w:color w:val="1F1F1F"/>
-        </w:rPr>
-        <w:t>2.4 Model B: Generation &amp; Hint Logic</w:t>
+        <w:spacing w:before="0"/>
+        <w:rPr>
+          <w:rFonts w:ascii="Google Sans" w:eastAsia="Google Sans" w:hAnsi="Google Sans" w:cs="Google Sans"/>
+        </w:rPr>
+      </w:pPr>
+      <w:r>
+        <w:rPr>
+          <w:rFonts w:ascii="Google Sans" w:eastAsia="Google Sans" w:hAnsi="Google Sans" w:cs="Google Sans"/>
+        </w:rPr>
+        <w:t>4.2 Model B: The Generator</w:t>
       </w:r>
     </w:p>
     <w:p>
@@ -718,34 +703,52 @@
           <w:right w:val="nil"/>
           <w:between w:val="nil"/>
         </w:pBdr>
-        <w:spacing w:after="120" w:line="275" w:lineRule="auto"/>
-        <w:rPr>
-          <w:rFonts w:ascii="Google Sans" w:eastAsia="Google Sans" w:hAnsi="Google Sans" w:cs="Google Sans"/>
-          <w:color w:val="1F1F1F"/>
-        </w:rPr>
-      </w:pPr>
-      <w:r>
-        <w:rPr>
-          <w:rFonts w:ascii="Google Sans" w:eastAsia="Google Sans" w:hAnsi="Google Sans" w:cs="Google Sans"/>
-          <w:color w:val="1F1F1F"/>
-        </w:rPr>
-        <w:t xml:space="preserve">Model B uses </w:t>
+        <w:spacing w:after="240" w:line="300" w:lineRule="auto"/>
+        <w:rPr>
+          <w:rFonts w:ascii="Google Sans" w:eastAsia="Google Sans" w:hAnsi="Google Sans" w:cs="Google Sans"/>
+        </w:rPr>
+      </w:pPr>
+      <w:r>
+        <w:rPr>
+          <w:rFonts w:ascii="Google Sans" w:eastAsia="Google Sans" w:hAnsi="Google Sans" w:cs="Google Sans"/>
+        </w:rPr>
+        <w:t xml:space="preserve">Model B operates via </w:t>
       </w:r>
       <w:r>
         <w:rPr>
           <w:rFonts w:ascii="Google Sans" w:eastAsia="Google Sans" w:hAnsi="Google Sans" w:cs="Google Sans"/>
           <w:b/>
           <w:bCs/>
-          <w:color w:val="1F1F1F"/>
         </w:rPr>
         <w:t>Cosine Similarity</w:t>
       </w:r>
       <w:r>
         <w:rPr>
           <w:rFonts w:ascii="Google Sans" w:eastAsia="Google Sans" w:hAnsi="Google Sans" w:cs="Google Sans"/>
-          <w:color w:val="1F1F1F"/>
-        </w:rPr>
-        <w:t xml:space="preserve"> in the TF-IDF vector space to rank passage sentences:</w:t>
+        </w:rPr>
+        <w:t xml:space="preserve">. It identifies sentences in the article that share </w:t>
+      </w:r>
+      <w:r>
+        <w:rPr>
+          <w:rFonts w:ascii="Google Sans" w:eastAsia="Google Sans" w:hAnsi="Google Sans" w:cs="Google Sans"/>
+        </w:rPr>
+        <w:lastRenderedPageBreak/>
+        <w:t>significant semantic space with the correct answer to serve as plausible distractors. The graduated hint logic extracts three sentences based on tiered similarity scores to guide the user from context to explicit evidence.</w:t>
+      </w:r>
+    </w:p>
+    <w:p>
+      <w:pPr>
+        <w:pStyle w:val="Heading3"/>
+        <w:spacing w:before="0"/>
+        <w:rPr>
+          <w:rFonts w:ascii="Google Sans" w:eastAsia="Google Sans" w:hAnsi="Google Sans" w:cs="Google Sans"/>
+        </w:rPr>
+      </w:pPr>
+      <w:r>
+        <w:rPr>
+          <w:rFonts w:ascii="Google Sans" w:eastAsia="Google Sans" w:hAnsi="Google Sans" w:cs="Google Sans"/>
+        </w:rPr>
+        <w:t>4.3 Technical Stack</w:t>
       </w:r>
     </w:p>
     <w:p>
@@ -761,23 +764,21 @@
           <w:right w:val="nil"/>
           <w:between w:val="nil"/>
         </w:pBdr>
-        <w:spacing w:line="275" w:lineRule="auto"/>
+        <w:spacing w:line="300" w:lineRule="auto"/>
       </w:pPr>
       <w:r>
         <w:rPr>
           <w:rFonts w:ascii="Google Sans" w:eastAsia="Google Sans" w:hAnsi="Google Sans" w:cs="Google Sans"/>
           <w:b/>
           <w:bCs/>
-          <w:color w:val="1F1F1F"/>
-        </w:rPr>
-        <w:t>Distractors:</w:t>
-      </w:r>
-      <w:r>
-        <w:rPr>
-          <w:rFonts w:ascii="Google Sans" w:eastAsia="Google Sans" w:hAnsi="Google Sans" w:cs="Google Sans"/>
-          <w:color w:val="1F1F1F"/>
-        </w:rPr>
-        <w:t xml:space="preserve"> Sentences with high semantic overlap to the answer but distinct meanings.</w:t>
+        </w:rPr>
+        <w:t>Languages:</w:t>
+      </w:r>
+      <w:r>
+        <w:rPr>
+          <w:rFonts w:ascii="Google Sans" w:eastAsia="Google Sans" w:hAnsi="Google Sans" w:cs="Google Sans"/>
+        </w:rPr>
+        <w:t xml:space="preserve"> Python 3.10</w:t>
       </w:r>
     </w:p>
     <w:p>
@@ -793,61 +794,29 @@
           <w:right w:val="nil"/>
           <w:between w:val="nil"/>
         </w:pBdr>
-        <w:spacing w:after="120" w:line="275" w:lineRule="auto"/>
+        <w:spacing w:line="300" w:lineRule="auto"/>
       </w:pPr>
       <w:r>
         <w:rPr>
           <w:rFonts w:ascii="Google Sans" w:eastAsia="Google Sans" w:hAnsi="Google Sans" w:cs="Google Sans"/>
           <w:b/>
           <w:bCs/>
-          <w:color w:val="1F1F1F"/>
-        </w:rPr>
-        <w:t>Graduated Hints:</w:t>
-      </w:r>
-      <w:r>
-        <w:rPr>
-          <w:rFonts w:ascii="Google Sans" w:eastAsia="Google Sans" w:hAnsi="Google Sans" w:cs="Google Sans"/>
-          <w:color w:val="1F1F1F"/>
-        </w:rPr>
-        <w:t xml:space="preserve"> A three-stage extraction pipeline providing a General Clue, an Intermediate Supporting Detail, and finally the Evidence Sentence (Near-Explicit).</w:t>
-      </w:r>
-    </w:p>
-    <w:p>
-      <w:pPr>
-        <w:pStyle w:val="Heading2"/>
-        <w:spacing w:before="120" w:after="120" w:line="275" w:lineRule="auto"/>
-        <w:rPr>
-          <w:rFonts w:ascii="Google Sans" w:eastAsia="Google Sans" w:hAnsi="Google Sans" w:cs="Google Sans"/>
-          <w:color w:val="1F1F1F"/>
-        </w:rPr>
-      </w:pPr>
-      <w:r>
-        <w:rPr>
-          <w:rFonts w:ascii="Google Sans" w:eastAsia="Google Sans" w:hAnsi="Google Sans" w:cs="Google Sans"/>
-          <w:color w:val="1F1F1F"/>
-        </w:rPr>
-        <w:t>3. Results and Analysis</w:t>
-      </w:r>
-    </w:p>
-    <w:p>
-      <w:pPr>
-        <w:pStyle w:val="Heading3"/>
-        <w:spacing w:before="0" w:after="120" w:line="275" w:lineRule="auto"/>
-        <w:rPr>
-          <w:rFonts w:ascii="Google Sans" w:eastAsia="Google Sans" w:hAnsi="Google Sans" w:cs="Google Sans"/>
-          <w:color w:val="1F1F1F"/>
-        </w:rPr>
-      </w:pPr>
-      <w:r>
-        <w:rPr>
-          <w:rFonts w:ascii="Google Sans" w:eastAsia="Google Sans" w:hAnsi="Google Sans" w:cs="Google Sans"/>
-          <w:color w:val="1F1F1F"/>
-        </w:rPr>
-        <w:t>3.1 Model A: Classification Performance</w:t>
-      </w:r>
-    </w:p>
-    <w:p>
-      <w:pPr>
+        </w:rPr>
+        <w:t>Libraries:</w:t>
+      </w:r>
+      <w:r>
+        <w:rPr>
+          <w:rFonts w:ascii="Google Sans" w:eastAsia="Google Sans" w:hAnsi="Google Sans" w:cs="Google Sans"/>
+        </w:rPr>
+        <w:t xml:space="preserve"> Scikit-Learn, NLTK, Joblib, Pandas</w:t>
+      </w:r>
+    </w:p>
+    <w:p>
+      <w:pPr>
+        <w:numPr>
+          <w:ilvl w:val="0"/>
+          <w:numId w:val="3"/>
+        </w:numPr>
         <w:pBdr>
           <w:top w:val="nil"/>
           <w:left w:val="nil"/>
@@ -855,38 +824,37 @@
           <w:right w:val="nil"/>
           <w:between w:val="nil"/>
         </w:pBdr>
-        <w:spacing w:after="240" w:line="275" w:lineRule="auto"/>
-        <w:rPr>
-          <w:rFonts w:ascii="Google Sans" w:eastAsia="Google Sans" w:hAnsi="Google Sans" w:cs="Google Sans"/>
-          <w:color w:val="1F1F1F"/>
-        </w:rPr>
-      </w:pPr>
-      <w:r>
-        <w:rPr>
-          <w:rFonts w:ascii="Google Sans" w:eastAsia="Google Sans" w:hAnsi="Google Sans" w:cs="Google Sans"/>
-          <w:color w:val="1F1F1F"/>
-        </w:rPr>
-        <w:t xml:space="preserve">Initial baseline models suffered from the "75% Accuracy Trap" (predicting only the majority class). By applying aggressive class-weight </w:t>
-      </w:r>
-      <w:proofErr w:type="gramStart"/>
-      <w:r>
-        <w:rPr>
-          <w:rFonts w:ascii="Google Sans" w:eastAsia="Google Sans" w:hAnsi="Google Sans" w:cs="Google Sans"/>
-          <w:color w:val="1F1F1F"/>
-        </w:rPr>
-        <w:t>balancing ,</w:t>
-      </w:r>
-      <w:proofErr w:type="gramEnd"/>
-      <w:r>
-        <w:rPr>
-          <w:rFonts w:ascii="Google Sans" w:eastAsia="Google Sans" w:hAnsi="Google Sans" w:cs="Google Sans"/>
-          <w:color w:val="1F1F1F"/>
-        </w:rPr>
-        <w:t xml:space="preserve"> we achieved a model that successfully identifies correct answers.</w:t>
-      </w:r>
-    </w:p>
-    <w:p>
-      <w:pPr>
+        <w:spacing w:line="300" w:lineRule="auto"/>
+      </w:pPr>
+      <w:r>
+        <w:rPr>
+          <w:rFonts w:ascii="Google Sans" w:eastAsia="Google Sans" w:hAnsi="Google Sans" w:cs="Google Sans"/>
+          <w:b/>
+          <w:bCs/>
+        </w:rPr>
+        <w:t>Interface:</w:t>
+      </w:r>
+      <w:r>
+        <w:rPr>
+          <w:rFonts w:ascii="Google Sans" w:eastAsia="Google Sans" w:hAnsi="Google Sans" w:cs="Google Sans"/>
+        </w:rPr>
+        <w:t xml:space="preserve"> </w:t>
+      </w:r>
+      <w:proofErr w:type="spellStart"/>
+      <w:r>
+        <w:rPr>
+          <w:rFonts w:ascii="Google Sans" w:eastAsia="Google Sans" w:hAnsi="Google Sans" w:cs="Google Sans"/>
+        </w:rPr>
+        <w:t>Streamlit</w:t>
+      </w:r>
+      <w:proofErr w:type="spellEnd"/>
+    </w:p>
+    <w:p>
+      <w:pPr>
+        <w:numPr>
+          <w:ilvl w:val="0"/>
+          <w:numId w:val="3"/>
+        </w:numPr>
         <w:pBdr>
           <w:top w:val="nil"/>
           <w:left w:val="nil"/>
@@ -894,25 +862,93 @@
           <w:right w:val="nil"/>
           <w:between w:val="nil"/>
         </w:pBdr>
-        <w:spacing w:line="276" w:lineRule="auto"/>
-        <w:rPr>
-          <w:rFonts w:ascii="Google Sans" w:eastAsia="Google Sans" w:hAnsi="Google Sans" w:cs="Google Sans"/>
-          <w:color w:val="1F1F1F"/>
-        </w:rPr>
-      </w:pPr>
+        <w:spacing w:line="300" w:lineRule="auto"/>
+      </w:pPr>
+      <w:r>
+        <w:rPr>
+          <w:rFonts w:ascii="Google Sans" w:eastAsia="Google Sans" w:hAnsi="Google Sans" w:cs="Google Sans"/>
+          <w:b/>
+          <w:bCs/>
+        </w:rPr>
+        <w:t>Hardware:</w:t>
+      </w:r>
+      <w:r>
+        <w:rPr>
+          <w:rFonts w:ascii="Google Sans" w:eastAsia="Google Sans" w:hAnsi="Google Sans" w:cs="Google Sans"/>
+        </w:rPr>
+        <w:t xml:space="preserve"> Ryzen 5 5600X, 32GB DDR4 RAM</w:t>
+      </w:r>
+    </w:p>
+    <w:p>
+      <w:pPr>
+        <w:pStyle w:val="Heading2"/>
+        <w:spacing w:before="450" w:after="315"/>
+        <w:rPr>
+          <w:rFonts w:ascii="Google Sans" w:eastAsia="Google Sans" w:hAnsi="Google Sans" w:cs="Google Sans"/>
+        </w:rPr>
+      </w:pPr>
+      <w:r>
+        <w:rPr>
+          <w:rFonts w:ascii="Google Sans" w:eastAsia="Google Sans" w:hAnsi="Google Sans" w:cs="Google Sans"/>
+        </w:rPr>
+        <w:t>5. Results and Evaluation</w:t>
+      </w:r>
+    </w:p>
+    <w:p>
+      <w:pPr>
+        <w:pStyle w:val="Heading3"/>
+        <w:spacing w:before="0"/>
+        <w:rPr>
+          <w:rFonts w:ascii="Google Sans" w:eastAsia="Google Sans" w:hAnsi="Google Sans" w:cs="Google Sans"/>
+          <w:color w:val="2D3748"/>
+        </w:rPr>
+      </w:pPr>
+      <w:r>
+        <w:pict w14:anchorId="645FCEE0">
+          <v:rect id="_x0000_i1029" style="width:0;height:1.5pt" o:hralign="center" o:hrstd="t" o:hr="t" fillcolor="#a0a0a0" stroked="f"/>
+        </w:pict>
+      </w:r>
+      <w:r>
+        <w:rPr>
+          <w:rFonts w:ascii="Google Sans" w:eastAsia="Google Sans" w:hAnsi="Google Sans" w:cs="Google Sans"/>
+          <w:color w:val="000000" w:themeColor="text1"/>
+        </w:rPr>
+        <w:t>5.1 Classification Metrics (Model A)</w:t>
+      </w:r>
+    </w:p>
+    <w:p>
+      <w:pPr>
+        <w:pBdr>
+          <w:top w:val="nil"/>
+          <w:left w:val="nil"/>
+          <w:bottom w:val="nil"/>
+          <w:right w:val="nil"/>
+          <w:between w:val="nil"/>
+        </w:pBdr>
+        <w:spacing w:line="300" w:lineRule="auto"/>
+        <w:rPr>
+          <w:rFonts w:ascii="Google Sans" w:eastAsia="Google Sans" w:hAnsi="Google Sans" w:cs="Google Sans"/>
+        </w:rPr>
+      </w:pPr>
+      <w:r>
+        <w:rPr>
+          <w:rFonts w:ascii="Google Sans" w:eastAsia="Google Sans" w:hAnsi="Google Sans" w:cs="Google Sans"/>
+        </w:rPr>
+        <w:t>The system effectively transitioned from a majority-class baseline to a functional predictive model by addressing class imbalance.</w:t>
+      </w:r>
     </w:p>
     <w:tbl>
       <w:tblPr>
-        <w:tblStyle w:val="a0"/>
+        <w:tblStyle w:val="a"/>
         <w:tblW w:w="9360" w:type="dxa"/>
         <w:tblInd w:w="0" w:type="dxa"/>
         <w:tblBorders>
-          <w:top w:val="single" w:sz="6" w:space="0" w:color="000000"/>
-          <w:left w:val="single" w:sz="6" w:space="0" w:color="000000"/>
-          <w:bottom w:val="single" w:sz="6" w:space="0" w:color="000000"/>
-          <w:right w:val="single" w:sz="6" w:space="0" w:color="000000"/>
-          <w:insideH w:val="single" w:sz="6" w:space="0" w:color="000000"/>
-          <w:insideV w:val="single" w:sz="6" w:space="0" w:color="000000"/>
+          <w:top w:val="single" w:sz="6" w:space="0" w:color="E2E8F0"/>
+          <w:left w:val="single" w:sz="6" w:space="0" w:color="E2E8F0"/>
+          <w:bottom w:val="single" w:sz="6" w:space="0" w:color="E2E8F0"/>
+          <w:right w:val="single" w:sz="6" w:space="0" w:color="E2E8F0"/>
+          <w:insideH w:val="single" w:sz="6" w:space="0" w:color="E2E8F0"/>
+          <w:insideV w:val="single" w:sz="6" w:space="0" w:color="E2E8F0"/>
         </w:tblBorders>
         <w:tblLayout w:type="fixed"/>
         <w:tblLook w:val="0600" w:firstRow="0" w:lastRow="0" w:firstColumn="0" w:lastColumn="0" w:noHBand="1" w:noVBand="1"/>
@@ -922,20 +958,23 @@
         <w:gridCol w:w="4680"/>
       </w:tblGrid>
       <w:tr>
+        <w:trPr>
+          <w:tblHeader/>
+        </w:trPr>
         <w:tc>
           <w:tcPr>
             <w:tcW w:w="4680" w:type="dxa"/>
             <w:tcBorders>
-              <w:top w:val="single" w:sz="6" w:space="0" w:color="000000"/>
-              <w:left w:val="single" w:sz="6" w:space="0" w:color="000000"/>
-              <w:bottom w:val="single" w:sz="6" w:space="0" w:color="000000"/>
-              <w:right w:val="single" w:sz="6" w:space="0" w:color="000000"/>
+              <w:top w:val="single" w:sz="6" w:space="0" w:color="E2E8F0"/>
+              <w:left w:val="single" w:sz="6" w:space="0" w:color="E2E8F0"/>
+              <w:bottom w:val="single" w:sz="6" w:space="0" w:color="E2E8F0"/>
+              <w:right w:val="single" w:sz="6" w:space="0" w:color="E2E8F0"/>
             </w:tcBorders>
-            <w:shd w:val="clear" w:color="auto" w:fill="F8FAFD"/>
+            <w:shd w:val="clear" w:color="auto" w:fill="F8FAFC"/>
             <w:tcMar>
-              <w:top w:w="120" w:type="dxa"/>
+              <w:top w:w="180" w:type="dxa"/>
               <w:left w:w="180" w:type="dxa"/>
-              <w:bottom w:w="120" w:type="dxa"/>
+              <w:bottom w:w="180" w:type="dxa"/>
               <w:right w:w="180" w:type="dxa"/>
             </w:tcMar>
           </w:tcPr>
@@ -948,20 +987,14 @@
                 <w:right w:val="nil"/>
                 <w:between w:val="nil"/>
               </w:pBdr>
-              <w:spacing w:line="275" w:lineRule="auto"/>
+              <w:spacing w:before="180" w:after="180"/>
               <w:rPr>
                 <w:rFonts w:ascii="Google Sans" w:eastAsia="Google Sans" w:hAnsi="Google Sans" w:cs="Google Sans"/>
-                <w:b/>
-                <w:bCs/>
-                <w:color w:val="1F1F1F"/>
               </w:rPr>
             </w:pPr>
             <w:r>
               <w:rPr>
                 <w:rFonts w:ascii="Google Sans" w:eastAsia="Google Sans" w:hAnsi="Google Sans" w:cs="Google Sans"/>
-                <w:b/>
-                <w:bCs/>
-                <w:color w:val="1F1F1F"/>
               </w:rPr>
               <w:t>Metric</w:t>
             </w:r>
@@ -971,16 +1004,16 @@
           <w:tcPr>
             <w:tcW w:w="4680" w:type="dxa"/>
             <w:tcBorders>
-              <w:top w:val="single" w:sz="6" w:space="0" w:color="000000"/>
-              <w:left w:val="single" w:sz="6" w:space="0" w:color="000000"/>
-              <w:bottom w:val="single" w:sz="6" w:space="0" w:color="000000"/>
-              <w:right w:val="single" w:sz="6" w:space="0" w:color="000000"/>
+              <w:top w:val="single" w:sz="6" w:space="0" w:color="E2E8F0"/>
+              <w:left w:val="single" w:sz="6" w:space="0" w:color="E2E8F0"/>
+              <w:bottom w:val="single" w:sz="6" w:space="0" w:color="E2E8F0"/>
+              <w:right w:val="single" w:sz="6" w:space="0" w:color="E2E8F0"/>
             </w:tcBorders>
-            <w:shd w:val="clear" w:color="auto" w:fill="F8FAFD"/>
+            <w:shd w:val="clear" w:color="auto" w:fill="F8FAFC"/>
             <w:tcMar>
-              <w:top w:w="120" w:type="dxa"/>
+              <w:top w:w="180" w:type="dxa"/>
               <w:left w:w="180" w:type="dxa"/>
-              <w:bottom w:w="120" w:type="dxa"/>
+              <w:bottom w:w="180" w:type="dxa"/>
               <w:right w:w="180" w:type="dxa"/>
             </w:tcMar>
           </w:tcPr>
@@ -993,22 +1026,36 @@
                 <w:right w:val="nil"/>
                 <w:between w:val="nil"/>
               </w:pBdr>
-              <w:spacing w:line="275" w:lineRule="auto"/>
+              <w:spacing w:before="180" w:after="180"/>
               <w:rPr>
                 <w:rFonts w:ascii="Google Sans" w:eastAsia="Google Sans" w:hAnsi="Google Sans" w:cs="Google Sans"/>
-                <w:b/>
-                <w:bCs/>
-                <w:color w:val="1F1F1F"/>
               </w:rPr>
             </w:pPr>
             <w:r>
               <w:rPr>
                 <w:rFonts w:ascii="Google Sans" w:eastAsia="Google Sans" w:hAnsi="Google Sans" w:cs="Google Sans"/>
-                <w:b/>
-                <w:bCs/>
-                <w:color w:val="1F1F1F"/>
               </w:rPr>
-              <w:t>Logistic Regression (Balanced)</w:t>
+              <w:t>Result</w:t>
+            </w:r>
+          </w:p>
+          <w:p>
+            <w:pPr>
+              <w:pBdr>
+                <w:top w:val="nil"/>
+                <w:left w:val="nil"/>
+                <w:bottom w:val="nil"/>
+                <w:right w:val="nil"/>
+                <w:between w:val="nil"/>
+              </w:pBdr>
+              <w:rPr>
+                <w:rFonts w:ascii="Google Sans" w:eastAsia="Google Sans" w:hAnsi="Google Sans" w:cs="Google Sans"/>
+              </w:rPr>
+            </w:pPr>
+            <w:r>
+              <w:rPr>
+                <w:rFonts w:ascii="Google Sans" w:eastAsia="Google Sans" w:hAnsi="Google Sans" w:cs="Google Sans"/>
+              </w:rPr>
+              <w:t xml:space="preserve"> </w:t>
             </w:r>
           </w:p>
         </w:tc>
@@ -1018,16 +1065,15 @@
           <w:tcPr>
             <w:tcW w:w="4680" w:type="dxa"/>
             <w:tcBorders>
-              <w:top w:val="single" w:sz="6" w:space="0" w:color="000000"/>
-              <w:left w:val="single" w:sz="6" w:space="0" w:color="000000"/>
-              <w:bottom w:val="single" w:sz="6" w:space="0" w:color="000000"/>
-              <w:right w:val="single" w:sz="6" w:space="0" w:color="000000"/>
+              <w:top w:val="single" w:sz="6" w:space="0" w:color="E2E8F0"/>
+              <w:left w:val="single" w:sz="6" w:space="0" w:color="E2E8F0"/>
+              <w:bottom w:val="single" w:sz="6" w:space="0" w:color="E2E8F0"/>
+              <w:right w:val="single" w:sz="6" w:space="0" w:color="E2E8F0"/>
             </w:tcBorders>
-            <w:shd w:val="clear" w:color="auto" w:fill="F8FAFD"/>
             <w:tcMar>
-              <w:top w:w="120" w:type="dxa"/>
+              <w:top w:w="180" w:type="dxa"/>
               <w:left w:w="180" w:type="dxa"/>
-              <w:bottom w:w="120" w:type="dxa"/>
+              <w:bottom w:w="180" w:type="dxa"/>
               <w:right w:w="180" w:type="dxa"/>
             </w:tcMar>
           </w:tcPr>
@@ -1040,20 +1086,14 @@
                 <w:right w:val="nil"/>
                 <w:between w:val="nil"/>
               </w:pBdr>
-              <w:spacing w:line="275" w:lineRule="auto"/>
+              <w:spacing w:before="180" w:after="180"/>
               <w:rPr>
                 <w:rFonts w:ascii="Google Sans" w:eastAsia="Google Sans" w:hAnsi="Google Sans" w:cs="Google Sans"/>
-                <w:b/>
-                <w:bCs/>
-                <w:color w:val="1F1F1F"/>
               </w:rPr>
             </w:pPr>
             <w:r>
               <w:rPr>
                 <w:rFonts w:ascii="Google Sans" w:eastAsia="Google Sans" w:hAnsi="Google Sans" w:cs="Google Sans"/>
-                <w:b/>
-                <w:bCs/>
-                <w:color w:val="1F1F1F"/>
               </w:rPr>
               <w:t>Overall Accuracy</w:t>
             </w:r>
@@ -1063,16 +1103,15 @@
           <w:tcPr>
             <w:tcW w:w="4680" w:type="dxa"/>
             <w:tcBorders>
-              <w:top w:val="single" w:sz="6" w:space="0" w:color="000000"/>
-              <w:left w:val="single" w:sz="6" w:space="0" w:color="000000"/>
-              <w:bottom w:val="single" w:sz="6" w:space="0" w:color="000000"/>
-              <w:right w:val="single" w:sz="6" w:space="0" w:color="000000"/>
+              <w:top w:val="single" w:sz="6" w:space="0" w:color="E2E8F0"/>
+              <w:left w:val="single" w:sz="6" w:space="0" w:color="E2E8F0"/>
+              <w:bottom w:val="single" w:sz="6" w:space="0" w:color="E2E8F0"/>
+              <w:right w:val="single" w:sz="6" w:space="0" w:color="E2E8F0"/>
             </w:tcBorders>
-            <w:shd w:val="clear" w:color="auto" w:fill="F8FAFD"/>
             <w:tcMar>
-              <w:top w:w="120" w:type="dxa"/>
+              <w:top w:w="180" w:type="dxa"/>
               <w:left w:w="180" w:type="dxa"/>
-              <w:bottom w:w="120" w:type="dxa"/>
+              <w:bottom w:w="180" w:type="dxa"/>
               <w:right w:w="180" w:type="dxa"/>
             </w:tcMar>
           </w:tcPr>
@@ -1085,18 +1124,16 @@
                 <w:right w:val="nil"/>
                 <w:between w:val="nil"/>
               </w:pBdr>
-              <w:spacing w:line="275" w:lineRule="auto"/>
+              <w:spacing w:before="180" w:after="180"/>
               <w:rPr>
                 <w:rFonts w:ascii="Google Sans" w:eastAsia="Google Sans" w:hAnsi="Google Sans" w:cs="Google Sans"/>
-                <w:color w:val="1F1F1F"/>
               </w:rPr>
             </w:pPr>
             <w:r>
               <w:rPr>
                 <w:rFonts w:ascii="Google Sans" w:eastAsia="Google Sans" w:hAnsi="Google Sans" w:cs="Google Sans"/>
-                <w:color w:val="1F1F1F"/>
               </w:rPr>
-              <w:t>39%</w:t>
+              <w:t>58%</w:t>
             </w:r>
           </w:p>
         </w:tc>
@@ -1106,16 +1143,16 @@
           <w:tcPr>
             <w:tcW w:w="4680" w:type="dxa"/>
             <w:tcBorders>
-              <w:top w:val="single" w:sz="6" w:space="0" w:color="000000"/>
-              <w:left w:val="single" w:sz="6" w:space="0" w:color="000000"/>
-              <w:bottom w:val="single" w:sz="6" w:space="0" w:color="000000"/>
-              <w:right w:val="single" w:sz="6" w:space="0" w:color="000000"/>
+              <w:top w:val="single" w:sz="6" w:space="0" w:color="E2E8F0"/>
+              <w:left w:val="single" w:sz="6" w:space="0" w:color="E2E8F0"/>
+              <w:bottom w:val="single" w:sz="6" w:space="0" w:color="E2E8F0"/>
+              <w:right w:val="single" w:sz="6" w:space="0" w:color="E2E8F0"/>
             </w:tcBorders>
-            <w:shd w:val="clear" w:color="auto" w:fill="F8FAFD"/>
+            <w:shd w:val="clear" w:color="auto" w:fill="F8FAFC"/>
             <w:tcMar>
-              <w:top w:w="120" w:type="dxa"/>
+              <w:top w:w="180" w:type="dxa"/>
               <w:left w:w="180" w:type="dxa"/>
-              <w:bottom w:w="120" w:type="dxa"/>
+              <w:bottom w:w="180" w:type="dxa"/>
               <w:right w:w="180" w:type="dxa"/>
             </w:tcMar>
           </w:tcPr>
@@ -1128,22 +1165,16 @@
                 <w:right w:val="nil"/>
                 <w:between w:val="nil"/>
               </w:pBdr>
-              <w:spacing w:line="275" w:lineRule="auto"/>
+              <w:spacing w:before="180" w:after="180"/>
               <w:rPr>
                 <w:rFonts w:ascii="Google Sans" w:eastAsia="Google Sans" w:hAnsi="Google Sans" w:cs="Google Sans"/>
-                <w:b/>
-                <w:bCs/>
-                <w:color w:val="1F1F1F"/>
               </w:rPr>
             </w:pPr>
             <w:r>
               <w:rPr>
                 <w:rFonts w:ascii="Google Sans" w:eastAsia="Google Sans" w:hAnsi="Google Sans" w:cs="Google Sans"/>
-                <w:b/>
-                <w:bCs/>
-                <w:color w:val="1F1F1F"/>
               </w:rPr>
-              <w:t>True Positives (Correctly Identified)</w:t>
+              <w:t>Weighted F1-Score</w:t>
             </w:r>
           </w:p>
         </w:tc>
@@ -1151,16 +1182,16 @@
           <w:tcPr>
             <w:tcW w:w="4680" w:type="dxa"/>
             <w:tcBorders>
-              <w:top w:val="single" w:sz="6" w:space="0" w:color="000000"/>
-              <w:left w:val="single" w:sz="6" w:space="0" w:color="000000"/>
-              <w:bottom w:val="single" w:sz="6" w:space="0" w:color="000000"/>
-              <w:right w:val="single" w:sz="6" w:space="0" w:color="000000"/>
+              <w:top w:val="single" w:sz="6" w:space="0" w:color="E2E8F0"/>
+              <w:left w:val="single" w:sz="6" w:space="0" w:color="E2E8F0"/>
+              <w:bottom w:val="single" w:sz="6" w:space="0" w:color="E2E8F0"/>
+              <w:right w:val="single" w:sz="6" w:space="0" w:color="E2E8F0"/>
             </w:tcBorders>
-            <w:shd w:val="clear" w:color="auto" w:fill="F8FAFD"/>
+            <w:shd w:val="clear" w:color="auto" w:fill="F8FAFC"/>
             <w:tcMar>
-              <w:top w:w="120" w:type="dxa"/>
+              <w:top w:w="180" w:type="dxa"/>
               <w:left w:w="180" w:type="dxa"/>
-              <w:bottom w:w="120" w:type="dxa"/>
+              <w:bottom w:w="180" w:type="dxa"/>
               <w:right w:w="180" w:type="dxa"/>
             </w:tcMar>
           </w:tcPr>
@@ -1173,18 +1204,16 @@
                 <w:right w:val="nil"/>
                 <w:between w:val="nil"/>
               </w:pBdr>
-              <w:spacing w:line="275" w:lineRule="auto"/>
+              <w:spacing w:before="180" w:after="180"/>
               <w:rPr>
                 <w:rFonts w:ascii="Google Sans" w:eastAsia="Google Sans" w:hAnsi="Google Sans" w:cs="Google Sans"/>
-                <w:color w:val="1F1F1F"/>
               </w:rPr>
             </w:pPr>
             <w:r>
               <w:rPr>
                 <w:rFonts w:ascii="Google Sans" w:eastAsia="Google Sans" w:hAnsi="Google Sans" w:cs="Google Sans"/>
-                <w:color w:val="1F1F1F"/>
               </w:rPr>
-              <w:t>2,167</w:t>
+              <w:t>0.60</w:t>
             </w:r>
           </w:p>
         </w:tc>
@@ -1194,16 +1223,15 @@
           <w:tcPr>
             <w:tcW w:w="4680" w:type="dxa"/>
             <w:tcBorders>
-              <w:top w:val="single" w:sz="6" w:space="0" w:color="000000"/>
-              <w:left w:val="single" w:sz="6" w:space="0" w:color="000000"/>
-              <w:bottom w:val="single" w:sz="6" w:space="0" w:color="000000"/>
-              <w:right w:val="single" w:sz="6" w:space="0" w:color="000000"/>
+              <w:top w:val="single" w:sz="6" w:space="0" w:color="E2E8F0"/>
+              <w:left w:val="single" w:sz="6" w:space="0" w:color="E2E8F0"/>
+              <w:bottom w:val="single" w:sz="6" w:space="0" w:color="E2E8F0"/>
+              <w:right w:val="single" w:sz="6" w:space="0" w:color="E2E8F0"/>
             </w:tcBorders>
-            <w:shd w:val="clear" w:color="auto" w:fill="F8FAFD"/>
             <w:tcMar>
-              <w:top w:w="120" w:type="dxa"/>
+              <w:top w:w="180" w:type="dxa"/>
               <w:left w:w="180" w:type="dxa"/>
-              <w:bottom w:w="120" w:type="dxa"/>
+              <w:bottom w:w="180" w:type="dxa"/>
               <w:right w:w="180" w:type="dxa"/>
             </w:tcMar>
           </w:tcPr>
@@ -1216,22 +1244,16 @@
                 <w:right w:val="nil"/>
                 <w:between w:val="nil"/>
               </w:pBdr>
-              <w:spacing w:line="275" w:lineRule="auto"/>
+              <w:spacing w:before="180" w:after="180"/>
               <w:rPr>
                 <w:rFonts w:ascii="Google Sans" w:eastAsia="Google Sans" w:hAnsi="Google Sans" w:cs="Google Sans"/>
-                <w:b/>
-                <w:bCs/>
-                <w:color w:val="1F1F1F"/>
               </w:rPr>
             </w:pPr>
             <w:r>
               <w:rPr>
                 <w:rFonts w:ascii="Google Sans" w:eastAsia="Google Sans" w:hAnsi="Google Sans" w:cs="Google Sans"/>
-                <w:b/>
-                <w:bCs/>
-                <w:color w:val="1F1F1F"/>
               </w:rPr>
-              <w:t>True Negatives (Correctly Identified)</w:t>
+              <w:t>Class 1 (Correct) Recall</w:t>
             </w:r>
           </w:p>
         </w:tc>
@@ -1239,16 +1261,15 @@
           <w:tcPr>
             <w:tcW w:w="4680" w:type="dxa"/>
             <w:tcBorders>
-              <w:top w:val="single" w:sz="6" w:space="0" w:color="000000"/>
-              <w:left w:val="single" w:sz="6" w:space="0" w:color="000000"/>
-              <w:bottom w:val="single" w:sz="6" w:space="0" w:color="000000"/>
-              <w:right w:val="single" w:sz="6" w:space="0" w:color="000000"/>
+              <w:top w:val="single" w:sz="6" w:space="0" w:color="E2E8F0"/>
+              <w:left w:val="single" w:sz="6" w:space="0" w:color="E2E8F0"/>
+              <w:bottom w:val="single" w:sz="6" w:space="0" w:color="E2E8F0"/>
+              <w:right w:val="single" w:sz="6" w:space="0" w:color="E2E8F0"/>
             </w:tcBorders>
-            <w:shd w:val="clear" w:color="auto" w:fill="F8FAFD"/>
             <w:tcMar>
-              <w:top w:w="120" w:type="dxa"/>
+              <w:top w:w="180" w:type="dxa"/>
               <w:left w:w="180" w:type="dxa"/>
-              <w:bottom w:w="120" w:type="dxa"/>
+              <w:bottom w:w="180" w:type="dxa"/>
               <w:right w:w="180" w:type="dxa"/>
             </w:tcMar>
           </w:tcPr>
@@ -1261,18 +1282,16 @@
                 <w:right w:val="nil"/>
                 <w:between w:val="nil"/>
               </w:pBdr>
-              <w:spacing w:line="275" w:lineRule="auto"/>
+              <w:spacing w:before="180" w:after="180"/>
               <w:rPr>
                 <w:rFonts w:ascii="Google Sans" w:eastAsia="Google Sans" w:hAnsi="Google Sans" w:cs="Google Sans"/>
-                <w:color w:val="1F1F1F"/>
               </w:rPr>
             </w:pPr>
             <w:r>
               <w:rPr>
                 <w:rFonts w:ascii="Google Sans" w:eastAsia="Google Sans" w:hAnsi="Google Sans" w:cs="Google Sans"/>
-                <w:color w:val="1F1F1F"/>
               </w:rPr>
-              <w:t>11,451</w:t>
+              <w:t>0.54</w:t>
             </w:r>
           </w:p>
         </w:tc>
@@ -1282,16 +1301,16 @@
           <w:tcPr>
             <w:tcW w:w="4680" w:type="dxa"/>
             <w:tcBorders>
-              <w:top w:val="single" w:sz="6" w:space="0" w:color="000000"/>
-              <w:left w:val="single" w:sz="6" w:space="0" w:color="000000"/>
-              <w:bottom w:val="single" w:sz="6" w:space="0" w:color="000000"/>
-              <w:right w:val="single" w:sz="6" w:space="0" w:color="000000"/>
+              <w:top w:val="single" w:sz="6" w:space="0" w:color="E2E8F0"/>
+              <w:left w:val="single" w:sz="6" w:space="0" w:color="E2E8F0"/>
+              <w:bottom w:val="single" w:sz="6" w:space="0" w:color="E2E8F0"/>
+              <w:right w:val="single" w:sz="6" w:space="0" w:color="E2E8F0"/>
             </w:tcBorders>
-            <w:shd w:val="clear" w:color="auto" w:fill="F8FAFD"/>
+            <w:shd w:val="clear" w:color="auto" w:fill="F8FAFC"/>
             <w:tcMar>
-              <w:top w:w="120" w:type="dxa"/>
+              <w:top w:w="180" w:type="dxa"/>
               <w:left w:w="180" w:type="dxa"/>
-              <w:bottom w:w="120" w:type="dxa"/>
+              <w:bottom w:w="180" w:type="dxa"/>
               <w:right w:w="180" w:type="dxa"/>
             </w:tcMar>
           </w:tcPr>
@@ -1304,22 +1323,16 @@
                 <w:right w:val="nil"/>
                 <w:between w:val="nil"/>
               </w:pBdr>
-              <w:spacing w:line="275" w:lineRule="auto"/>
+              <w:spacing w:before="180" w:after="180"/>
               <w:rPr>
                 <w:rFonts w:ascii="Google Sans" w:eastAsia="Google Sans" w:hAnsi="Google Sans" w:cs="Google Sans"/>
-                <w:b/>
-                <w:bCs/>
-                <w:color w:val="1F1F1F"/>
               </w:rPr>
             </w:pPr>
             <w:r>
               <w:rPr>
                 <w:rFonts w:ascii="Google Sans" w:eastAsia="Google Sans" w:hAnsi="Google Sans" w:cs="Google Sans"/>
-                <w:b/>
-                <w:bCs/>
-                <w:color w:val="1F1F1F"/>
               </w:rPr>
-              <w:t>F1-Score (Class 1 - Correct Answers)</w:t>
+              <w:t>True Positives (Identified)</w:t>
             </w:r>
           </w:p>
         </w:tc>
@@ -1327,16 +1340,16 @@
           <w:tcPr>
             <w:tcW w:w="4680" w:type="dxa"/>
             <w:tcBorders>
-              <w:top w:val="single" w:sz="6" w:space="0" w:color="000000"/>
-              <w:left w:val="single" w:sz="6" w:space="0" w:color="000000"/>
-              <w:bottom w:val="single" w:sz="6" w:space="0" w:color="000000"/>
-              <w:right w:val="single" w:sz="6" w:space="0" w:color="000000"/>
+              <w:top w:val="single" w:sz="6" w:space="0" w:color="E2E8F0"/>
+              <w:left w:val="single" w:sz="6" w:space="0" w:color="E2E8F0"/>
+              <w:bottom w:val="single" w:sz="6" w:space="0" w:color="E2E8F0"/>
+              <w:right w:val="single" w:sz="6" w:space="0" w:color="E2E8F0"/>
             </w:tcBorders>
-            <w:shd w:val="clear" w:color="auto" w:fill="F8FAFD"/>
+            <w:shd w:val="clear" w:color="auto" w:fill="F8FAFC"/>
             <w:tcMar>
-              <w:top w:w="120" w:type="dxa"/>
+              <w:top w:w="180" w:type="dxa"/>
               <w:left w:w="180" w:type="dxa"/>
-              <w:bottom w:w="120" w:type="dxa"/>
+              <w:bottom w:w="180" w:type="dxa"/>
               <w:right w:w="180" w:type="dxa"/>
             </w:tcMar>
           </w:tcPr>
@@ -1349,22 +1362,16 @@
                 <w:right w:val="nil"/>
                 <w:between w:val="nil"/>
               </w:pBdr>
-              <w:spacing w:line="275" w:lineRule="auto"/>
+              <w:spacing w:before="180" w:after="180"/>
               <w:rPr>
                 <w:rFonts w:ascii="Google Sans" w:eastAsia="Google Sans" w:hAnsi="Google Sans" w:cs="Google Sans"/>
-                <w:b/>
-                <w:bCs/>
-                <w:color w:val="1F1F1F"/>
               </w:rPr>
             </w:pPr>
             <w:r>
               <w:rPr>
                 <w:rFonts w:ascii="Google Sans" w:eastAsia="Google Sans" w:hAnsi="Google Sans" w:cs="Google Sans"/>
-                <w:b/>
-                <w:bCs/>
-                <w:color w:val="1F1F1F"/>
               </w:rPr>
-              <w:t>0.17</w:t>
+              <w:t>4,734</w:t>
             </w:r>
           </w:p>
         </w:tc>
@@ -1372,100 +1379,26 @@
     </w:tbl>
     <w:p>
       <w:pPr>
-        <w:pBdr>
-          <w:top w:val="nil"/>
-          <w:left w:val="nil"/>
-          <w:bottom w:val="nil"/>
-          <w:right w:val="nil"/>
-          <w:between w:val="nil"/>
-        </w:pBdr>
-        <w:spacing w:before="480" w:after="240" w:line="275" w:lineRule="auto"/>
-        <w:rPr>
-          <w:rFonts w:ascii="Google Sans" w:eastAsia="Google Sans" w:hAnsi="Google Sans" w:cs="Google Sans"/>
-          <w:color w:val="1F1F1F"/>
-        </w:rPr>
-      </w:pPr>
-      <w:r>
-        <w:rPr>
-          <w:rFonts w:ascii="Google Sans" w:eastAsia="Google Sans" w:hAnsi="Google Sans" w:cs="Google Sans"/>
-          <w:b/>
-          <w:bCs/>
-          <w:color w:val="1F1F1F"/>
-        </w:rPr>
-        <w:lastRenderedPageBreak/>
-        <w:t xml:space="preserve">Confusion </w:t>
-      </w:r>
-      <w:proofErr w:type="gramStart"/>
-      <w:r>
-        <w:rPr>
-          <w:rFonts w:ascii="Google Sans" w:eastAsia="Google Sans" w:hAnsi="Google Sans" w:cs="Google Sans"/>
-          <w:b/>
-          <w:bCs/>
-          <w:color w:val="1F1F1F"/>
-        </w:rPr>
-        <w:t>Matrix:</w:t>
-      </w:r>
-      <w:r>
-        <w:rPr>
-          <w:rFonts w:ascii="Google Sans" w:eastAsia="Google Sans" w:hAnsi="Google Sans" w:cs="Google Sans"/>
-          <w:b/>
-          <w:bCs/>
-          <w:color w:val="1F1F1F"/>
-        </w:rPr>
-        <w:t>[</w:t>
-      </w:r>
-      <w:proofErr w:type="gramEnd"/>
-      <w:r>
-        <w:rPr>
-          <w:rFonts w:ascii="Google Sans" w:eastAsia="Google Sans" w:hAnsi="Google Sans" w:cs="Google Sans"/>
-          <w:color w:val="1F1F1F"/>
-        </w:rPr>
-        <w:t xml:space="preserve"> </w:t>
-      </w:r>
-      <w:r>
-        <w:rPr>
-          <w:rFonts w:ascii="Google Sans" w:eastAsia="Google Sans" w:hAnsi="Google Sans" w:cs="Google Sans"/>
-          <w:color w:val="1F1F1F"/>
-        </w:rPr>
-        <w:t xml:space="preserve">[11451 14909] [ </w:t>
-      </w:r>
-      <w:proofErr w:type="gramStart"/>
-      <w:r>
-        <w:rPr>
-          <w:rFonts w:ascii="Google Sans" w:eastAsia="Google Sans" w:hAnsi="Google Sans" w:cs="Google Sans"/>
-          <w:color w:val="1F1F1F"/>
-        </w:rPr>
-        <w:t>6619  2167]</w:t>
-      </w:r>
-      <w:r>
-        <w:rPr>
-          <w:rFonts w:ascii="Google Sans" w:eastAsia="Google Sans" w:hAnsi="Google Sans" w:cs="Google Sans"/>
-          <w:color w:val="1F1F1F"/>
-        </w:rPr>
-        <w:t xml:space="preserve"> ]</w:t>
-      </w:r>
-      <w:proofErr w:type="gramEnd"/>
-    </w:p>
-    <w:p>
-      <w:pPr>
         <w:pStyle w:val="Heading3"/>
-        <w:spacing w:after="120" w:line="275" w:lineRule="auto"/>
-        <w:rPr>
-          <w:rFonts w:ascii="Google Sans" w:eastAsia="Google Sans" w:hAnsi="Google Sans" w:cs="Google Sans"/>
-          <w:color w:val="1F1F1F"/>
-        </w:rPr>
-      </w:pPr>
-      <w:r>
-        <w:rPr>
-          <w:rFonts w:ascii="Google Sans" w:eastAsia="Google Sans" w:hAnsi="Google Sans" w:cs="Google Sans"/>
+        <w:spacing w:before="300"/>
+        <w:rPr>
+          <w:rFonts w:ascii="Google Sans" w:eastAsia="Google Sans" w:hAnsi="Google Sans" w:cs="Google Sans"/>
+          <w:color w:val="000000" w:themeColor="text1"/>
+        </w:rPr>
+      </w:pPr>
+      <w:r>
+        <w:rPr>
+          <w:rFonts w:ascii="Google Sans" w:eastAsia="Google Sans" w:hAnsi="Google Sans" w:cs="Google Sans"/>
+          <w:noProof/>
           <w:color w:val="1F1F1F"/>
           <w:sz w:val="22"/>
           <w:szCs w:val="22"/>
         </w:rPr>
+        <w:lastRenderedPageBreak/>
         <w:drawing>
-          <wp:inline distT="0" distB="0" distL="0" distR="0" wp14:anchorId="3F4C4F85" wp14:editId="6D93881E">
-            <wp:extent cx="3839111" cy="2333951"/>
-            <wp:effectExtent l="0" t="0" r="9525" b="9525"/>
+          <wp:inline distT="0" distB="0" distL="0" distR="0" wp14:anchorId="055339E7" wp14:editId="6420244D">
+            <wp:extent cx="3178464" cy="1932317"/>
+            <wp:effectExtent l="0" t="0" r="3175" b="0"/>
             <wp:docPr id="366921907" name="Picture 1"/>
             <wp:cNvGraphicFramePr>
               <a:graphicFrameLocks xmlns:a="http://schemas.openxmlformats.org/drawingml/2006/main" noChangeAspect="1"/>
@@ -1486,7 +1419,7 @@
                   <pic:spPr>
                     <a:xfrm>
                       <a:off x="0" y="0"/>
-                      <a:ext cx="3839111" cy="2333951"/>
+                      <a:ext cx="3180172" cy="1933355"/>
                     </a:xfrm>
                     <a:prstGeom prst="rect">
                       <a:avLst/>
@@ -1502,18 +1435,18 @@
     <w:p>
       <w:pPr>
         <w:pStyle w:val="Heading3"/>
-        <w:spacing w:after="120" w:line="275" w:lineRule="auto"/>
-        <w:rPr>
-          <w:rFonts w:ascii="Google Sans" w:eastAsia="Google Sans" w:hAnsi="Google Sans" w:cs="Google Sans"/>
-          <w:color w:val="1F1F1F"/>
-        </w:rPr>
-      </w:pPr>
-      <w:r>
-        <w:rPr>
-          <w:rFonts w:ascii="Google Sans" w:eastAsia="Google Sans" w:hAnsi="Google Sans" w:cs="Google Sans"/>
-          <w:color w:val="1F1F1F"/>
-        </w:rPr>
-        <w:t>3.2 Model B: NLP Generation Metrics</w:t>
+        <w:spacing w:before="300"/>
+        <w:rPr>
+          <w:rFonts w:ascii="Google Sans" w:eastAsia="Google Sans" w:hAnsi="Google Sans" w:cs="Google Sans"/>
+          <w:color w:val="000000" w:themeColor="text1"/>
+        </w:rPr>
+      </w:pPr>
+      <w:r>
+        <w:rPr>
+          <w:rFonts w:ascii="Google Sans" w:eastAsia="Google Sans" w:hAnsi="Google Sans" w:cs="Google Sans"/>
+          <w:color w:val="000000" w:themeColor="text1"/>
+        </w:rPr>
+        <w:t>5.2 Generation Metrics (Model B)</w:t>
       </w:r>
     </w:p>
     <w:p>
@@ -1525,32 +1458,30 @@
           <w:right w:val="nil"/>
           <w:between w:val="nil"/>
         </w:pBdr>
-        <w:spacing w:after="240" w:line="275" w:lineRule="auto"/>
-        <w:rPr>
-          <w:rFonts w:ascii="Google Sans" w:eastAsia="Google Sans" w:hAnsi="Google Sans" w:cs="Google Sans"/>
-          <w:color w:val="1F1F1F"/>
-        </w:rPr>
-      </w:pPr>
-      <w:r>
-        <w:rPr>
-          <w:rFonts w:ascii="Google Sans" w:eastAsia="Google Sans" w:hAnsi="Google Sans" w:cs="Google Sans"/>
-          <w:color w:val="1F1F1F"/>
-        </w:rPr>
-        <w:t>Model B was evaluated against human-written distractors using standard NLP generation metrics. The move to bigrams and lemmatization resulted in a 14x improvement over unigram baselines.</w:t>
+        <w:spacing w:line="300" w:lineRule="auto"/>
+        <w:rPr>
+          <w:rFonts w:ascii="Google Sans" w:eastAsia="Google Sans" w:hAnsi="Google Sans" w:cs="Google Sans"/>
+        </w:rPr>
+      </w:pPr>
+      <w:r>
+        <w:rPr>
+          <w:rFonts w:ascii="Google Sans" w:eastAsia="Google Sans" w:hAnsi="Google Sans" w:cs="Google Sans"/>
+        </w:rPr>
+        <w:t>Evaluation against human-written distractors in the RACE test set yielded the following scores:</w:t>
       </w:r>
     </w:p>
     <w:tbl>
       <w:tblPr>
-        <w:tblStyle w:val="a1"/>
+        <w:tblStyle w:val="a0"/>
         <w:tblW w:w="9360" w:type="dxa"/>
         <w:tblInd w:w="0" w:type="dxa"/>
         <w:tblBorders>
-          <w:top w:val="single" w:sz="6" w:space="0" w:color="000000"/>
-          <w:left w:val="single" w:sz="6" w:space="0" w:color="000000"/>
-          <w:bottom w:val="single" w:sz="6" w:space="0" w:color="000000"/>
-          <w:right w:val="single" w:sz="6" w:space="0" w:color="000000"/>
-          <w:insideH w:val="single" w:sz="6" w:space="0" w:color="000000"/>
-          <w:insideV w:val="single" w:sz="6" w:space="0" w:color="000000"/>
+          <w:top w:val="single" w:sz="6" w:space="0" w:color="E2E8F0"/>
+          <w:left w:val="single" w:sz="6" w:space="0" w:color="E2E8F0"/>
+          <w:bottom w:val="single" w:sz="6" w:space="0" w:color="E2E8F0"/>
+          <w:right w:val="single" w:sz="6" w:space="0" w:color="E2E8F0"/>
+          <w:insideH w:val="single" w:sz="6" w:space="0" w:color="E2E8F0"/>
+          <w:insideV w:val="single" w:sz="6" w:space="0" w:color="E2E8F0"/>
         </w:tblBorders>
         <w:tblLayout w:type="fixed"/>
         <w:tblLook w:val="0600" w:firstRow="0" w:lastRow="0" w:firstColumn="0" w:lastColumn="0" w:noHBand="1" w:noVBand="1"/>
@@ -1560,20 +1491,23 @@
         <w:gridCol w:w="4680"/>
       </w:tblGrid>
       <w:tr>
+        <w:trPr>
+          <w:tblHeader/>
+        </w:trPr>
         <w:tc>
           <w:tcPr>
             <w:tcW w:w="4680" w:type="dxa"/>
             <w:tcBorders>
-              <w:top w:val="single" w:sz="6" w:space="0" w:color="000000"/>
-              <w:left w:val="single" w:sz="6" w:space="0" w:color="000000"/>
-              <w:bottom w:val="single" w:sz="6" w:space="0" w:color="000000"/>
-              <w:right w:val="single" w:sz="6" w:space="0" w:color="000000"/>
+              <w:top w:val="single" w:sz="6" w:space="0" w:color="E2E8F0"/>
+              <w:left w:val="single" w:sz="6" w:space="0" w:color="E2E8F0"/>
+              <w:bottom w:val="single" w:sz="6" w:space="0" w:color="E2E8F0"/>
+              <w:right w:val="single" w:sz="6" w:space="0" w:color="E2E8F0"/>
             </w:tcBorders>
-            <w:shd w:val="clear" w:color="auto" w:fill="F8FAFD"/>
+            <w:shd w:val="clear" w:color="auto" w:fill="F8FAFC"/>
             <w:tcMar>
-              <w:top w:w="120" w:type="dxa"/>
+              <w:top w:w="180" w:type="dxa"/>
               <w:left w:w="180" w:type="dxa"/>
-              <w:bottom w:w="120" w:type="dxa"/>
+              <w:bottom w:w="180" w:type="dxa"/>
               <w:right w:w="180" w:type="dxa"/>
             </w:tcMar>
           </w:tcPr>
@@ -1586,22 +1520,16 @@
                 <w:right w:val="nil"/>
                 <w:between w:val="nil"/>
               </w:pBdr>
-              <w:spacing w:line="275" w:lineRule="auto"/>
+              <w:spacing w:before="180" w:after="180"/>
               <w:rPr>
                 <w:rFonts w:ascii="Google Sans" w:eastAsia="Google Sans" w:hAnsi="Google Sans" w:cs="Google Sans"/>
-                <w:b/>
-                <w:bCs/>
-                <w:color w:val="1F1F1F"/>
               </w:rPr>
             </w:pPr>
             <w:r>
               <w:rPr>
                 <w:rFonts w:ascii="Google Sans" w:eastAsia="Google Sans" w:hAnsi="Google Sans" w:cs="Google Sans"/>
-                <w:b/>
-                <w:bCs/>
-                <w:color w:val="1F1F1F"/>
               </w:rPr>
-              <w:t>Metric</w:t>
+              <w:t>NLP Metric</w:t>
             </w:r>
           </w:p>
         </w:tc>
@@ -1609,16 +1537,16 @@
           <w:tcPr>
             <w:tcW w:w="4680" w:type="dxa"/>
             <w:tcBorders>
-              <w:top w:val="single" w:sz="6" w:space="0" w:color="000000"/>
-              <w:left w:val="single" w:sz="6" w:space="0" w:color="000000"/>
-              <w:bottom w:val="single" w:sz="6" w:space="0" w:color="000000"/>
-              <w:right w:val="single" w:sz="6" w:space="0" w:color="000000"/>
+              <w:top w:val="single" w:sz="6" w:space="0" w:color="E2E8F0"/>
+              <w:left w:val="single" w:sz="6" w:space="0" w:color="E2E8F0"/>
+              <w:bottom w:val="single" w:sz="6" w:space="0" w:color="E2E8F0"/>
+              <w:right w:val="single" w:sz="6" w:space="0" w:color="E2E8F0"/>
             </w:tcBorders>
-            <w:shd w:val="clear" w:color="auto" w:fill="F8FAFD"/>
+            <w:shd w:val="clear" w:color="auto" w:fill="F8FAFC"/>
             <w:tcMar>
-              <w:top w:w="120" w:type="dxa"/>
+              <w:top w:w="180" w:type="dxa"/>
               <w:left w:w="180" w:type="dxa"/>
-              <w:bottom w:w="120" w:type="dxa"/>
+              <w:bottom w:w="180" w:type="dxa"/>
               <w:right w:w="180" w:type="dxa"/>
             </w:tcMar>
           </w:tcPr>
@@ -1631,22 +1559,36 @@
                 <w:right w:val="nil"/>
                 <w:between w:val="nil"/>
               </w:pBdr>
-              <w:spacing w:line="275" w:lineRule="auto"/>
+              <w:spacing w:before="180" w:after="180"/>
               <w:rPr>
                 <w:rFonts w:ascii="Google Sans" w:eastAsia="Google Sans" w:hAnsi="Google Sans" w:cs="Google Sans"/>
-                <w:b/>
-                <w:bCs/>
-                <w:color w:val="1F1F1F"/>
               </w:rPr>
             </w:pPr>
             <w:r>
               <w:rPr>
                 <w:rFonts w:ascii="Google Sans" w:eastAsia="Google Sans" w:hAnsi="Google Sans" w:cs="Google Sans"/>
-                <w:b/>
-                <w:bCs/>
-                <w:color w:val="1F1F1F"/>
               </w:rPr>
               <w:t>Score</w:t>
+            </w:r>
+          </w:p>
+          <w:p>
+            <w:pPr>
+              <w:pBdr>
+                <w:top w:val="nil"/>
+                <w:left w:val="nil"/>
+                <w:bottom w:val="nil"/>
+                <w:right w:val="nil"/>
+                <w:between w:val="nil"/>
+              </w:pBdr>
+              <w:rPr>
+                <w:rFonts w:ascii="Google Sans" w:eastAsia="Google Sans" w:hAnsi="Google Sans" w:cs="Google Sans"/>
+              </w:rPr>
+            </w:pPr>
+            <w:r>
+              <w:rPr>
+                <w:rFonts w:ascii="Google Sans" w:eastAsia="Google Sans" w:hAnsi="Google Sans" w:cs="Google Sans"/>
+              </w:rPr>
+              <w:t xml:space="preserve"> </w:t>
             </w:r>
           </w:p>
         </w:tc>
@@ -1656,16 +1598,15 @@
           <w:tcPr>
             <w:tcW w:w="4680" w:type="dxa"/>
             <w:tcBorders>
-              <w:top w:val="single" w:sz="6" w:space="0" w:color="000000"/>
-              <w:left w:val="single" w:sz="6" w:space="0" w:color="000000"/>
-              <w:bottom w:val="single" w:sz="6" w:space="0" w:color="000000"/>
-              <w:right w:val="single" w:sz="6" w:space="0" w:color="000000"/>
+              <w:top w:val="single" w:sz="6" w:space="0" w:color="E2E8F0"/>
+              <w:left w:val="single" w:sz="6" w:space="0" w:color="E2E8F0"/>
+              <w:bottom w:val="single" w:sz="6" w:space="0" w:color="E2E8F0"/>
+              <w:right w:val="single" w:sz="6" w:space="0" w:color="E2E8F0"/>
             </w:tcBorders>
-            <w:shd w:val="clear" w:color="auto" w:fill="F8FAFD"/>
             <w:tcMar>
-              <w:top w:w="120" w:type="dxa"/>
+              <w:top w:w="180" w:type="dxa"/>
               <w:left w:w="180" w:type="dxa"/>
-              <w:bottom w:w="120" w:type="dxa"/>
+              <w:bottom w:w="180" w:type="dxa"/>
               <w:right w:w="180" w:type="dxa"/>
             </w:tcMar>
           </w:tcPr>
@@ -1678,22 +1619,16 @@
                 <w:right w:val="nil"/>
                 <w:between w:val="nil"/>
               </w:pBdr>
-              <w:spacing w:line="275" w:lineRule="auto"/>
+              <w:spacing w:before="180" w:after="180"/>
               <w:rPr>
                 <w:rFonts w:ascii="Google Sans" w:eastAsia="Google Sans" w:hAnsi="Google Sans" w:cs="Google Sans"/>
-                <w:b/>
-                <w:bCs/>
-                <w:color w:val="1F1F1F"/>
               </w:rPr>
             </w:pPr>
             <w:r>
               <w:rPr>
                 <w:rFonts w:ascii="Google Sans" w:eastAsia="Google Sans" w:hAnsi="Google Sans" w:cs="Google Sans"/>
-                <w:b/>
-                <w:bCs/>
-                <w:color w:val="1F1F1F"/>
               </w:rPr>
-              <w:t>BLEU Score</w:t>
+              <w:t>BLEU</w:t>
             </w:r>
           </w:p>
         </w:tc>
@@ -1701,16 +1636,15 @@
           <w:tcPr>
             <w:tcW w:w="4680" w:type="dxa"/>
             <w:tcBorders>
-              <w:top w:val="single" w:sz="6" w:space="0" w:color="000000"/>
-              <w:left w:val="single" w:sz="6" w:space="0" w:color="000000"/>
-              <w:bottom w:val="single" w:sz="6" w:space="0" w:color="000000"/>
-              <w:right w:val="single" w:sz="6" w:space="0" w:color="000000"/>
+              <w:top w:val="single" w:sz="6" w:space="0" w:color="E2E8F0"/>
+              <w:left w:val="single" w:sz="6" w:space="0" w:color="E2E8F0"/>
+              <w:bottom w:val="single" w:sz="6" w:space="0" w:color="E2E8F0"/>
+              <w:right w:val="single" w:sz="6" w:space="0" w:color="E2E8F0"/>
             </w:tcBorders>
-            <w:shd w:val="clear" w:color="auto" w:fill="F8FAFD"/>
             <w:tcMar>
-              <w:top w:w="120" w:type="dxa"/>
+              <w:top w:w="180" w:type="dxa"/>
               <w:left w:w="180" w:type="dxa"/>
-              <w:bottom w:w="120" w:type="dxa"/>
+              <w:bottom w:w="180" w:type="dxa"/>
               <w:right w:w="180" w:type="dxa"/>
             </w:tcMar>
           </w:tcPr>
@@ -1723,20 +1657,14 @@
                 <w:right w:val="nil"/>
                 <w:between w:val="nil"/>
               </w:pBdr>
-              <w:spacing w:line="275" w:lineRule="auto"/>
+              <w:spacing w:before="180" w:after="180"/>
               <w:rPr>
                 <w:rFonts w:ascii="Google Sans" w:eastAsia="Google Sans" w:hAnsi="Google Sans" w:cs="Google Sans"/>
-                <w:b/>
-                <w:bCs/>
-                <w:color w:val="1F1F1F"/>
               </w:rPr>
             </w:pPr>
             <w:r>
               <w:rPr>
                 <w:rFonts w:ascii="Google Sans" w:eastAsia="Google Sans" w:hAnsi="Google Sans" w:cs="Google Sans"/>
-                <w:b/>
-                <w:bCs/>
-                <w:color w:val="1F1F1F"/>
               </w:rPr>
               <w:t>0.1026</w:t>
             </w:r>
@@ -1748,16 +1676,16 @@
           <w:tcPr>
             <w:tcW w:w="4680" w:type="dxa"/>
             <w:tcBorders>
-              <w:top w:val="single" w:sz="6" w:space="0" w:color="000000"/>
-              <w:left w:val="single" w:sz="6" w:space="0" w:color="000000"/>
-              <w:bottom w:val="single" w:sz="6" w:space="0" w:color="000000"/>
-              <w:right w:val="single" w:sz="6" w:space="0" w:color="000000"/>
+              <w:top w:val="single" w:sz="6" w:space="0" w:color="E2E8F0"/>
+              <w:left w:val="single" w:sz="6" w:space="0" w:color="E2E8F0"/>
+              <w:bottom w:val="single" w:sz="6" w:space="0" w:color="E2E8F0"/>
+              <w:right w:val="single" w:sz="6" w:space="0" w:color="E2E8F0"/>
             </w:tcBorders>
-            <w:shd w:val="clear" w:color="auto" w:fill="F8FAFD"/>
+            <w:shd w:val="clear" w:color="auto" w:fill="F8FAFC"/>
             <w:tcMar>
-              <w:top w:w="120" w:type="dxa"/>
+              <w:top w:w="180" w:type="dxa"/>
               <w:left w:w="180" w:type="dxa"/>
-              <w:bottom w:w="120" w:type="dxa"/>
+              <w:bottom w:w="180" w:type="dxa"/>
               <w:right w:w="180" w:type="dxa"/>
             </w:tcMar>
           </w:tcPr>
@@ -1770,20 +1698,14 @@
                 <w:right w:val="nil"/>
                 <w:between w:val="nil"/>
               </w:pBdr>
-              <w:spacing w:line="275" w:lineRule="auto"/>
+              <w:spacing w:before="180" w:after="180"/>
               <w:rPr>
                 <w:rFonts w:ascii="Google Sans" w:eastAsia="Google Sans" w:hAnsi="Google Sans" w:cs="Google Sans"/>
-                <w:b/>
-                <w:bCs/>
-                <w:color w:val="1F1F1F"/>
               </w:rPr>
             </w:pPr>
             <w:r>
               <w:rPr>
                 <w:rFonts w:ascii="Google Sans" w:eastAsia="Google Sans" w:hAnsi="Google Sans" w:cs="Google Sans"/>
-                <w:b/>
-                <w:bCs/>
-                <w:color w:val="1F1F1F"/>
               </w:rPr>
               <w:t>ROUGE-L</w:t>
             </w:r>
@@ -1793,16 +1715,16 @@
           <w:tcPr>
             <w:tcW w:w="4680" w:type="dxa"/>
             <w:tcBorders>
-              <w:top w:val="single" w:sz="6" w:space="0" w:color="000000"/>
-              <w:left w:val="single" w:sz="6" w:space="0" w:color="000000"/>
-              <w:bottom w:val="single" w:sz="6" w:space="0" w:color="000000"/>
-              <w:right w:val="single" w:sz="6" w:space="0" w:color="000000"/>
+              <w:top w:val="single" w:sz="6" w:space="0" w:color="E2E8F0"/>
+              <w:left w:val="single" w:sz="6" w:space="0" w:color="E2E8F0"/>
+              <w:bottom w:val="single" w:sz="6" w:space="0" w:color="E2E8F0"/>
+              <w:right w:val="single" w:sz="6" w:space="0" w:color="E2E8F0"/>
             </w:tcBorders>
-            <w:shd w:val="clear" w:color="auto" w:fill="F8FAFD"/>
+            <w:shd w:val="clear" w:color="auto" w:fill="F8FAFC"/>
             <w:tcMar>
-              <w:top w:w="120" w:type="dxa"/>
+              <w:top w:w="180" w:type="dxa"/>
               <w:left w:w="180" w:type="dxa"/>
-              <w:bottom w:w="120" w:type="dxa"/>
+              <w:bottom w:w="180" w:type="dxa"/>
               <w:right w:w="180" w:type="dxa"/>
             </w:tcMar>
           </w:tcPr>
@@ -1815,20 +1737,14 @@
                 <w:right w:val="nil"/>
                 <w:between w:val="nil"/>
               </w:pBdr>
-              <w:spacing w:line="275" w:lineRule="auto"/>
+              <w:spacing w:before="180" w:after="180"/>
               <w:rPr>
                 <w:rFonts w:ascii="Google Sans" w:eastAsia="Google Sans" w:hAnsi="Google Sans" w:cs="Google Sans"/>
-                <w:b/>
-                <w:bCs/>
-                <w:color w:val="1F1F1F"/>
               </w:rPr>
             </w:pPr>
             <w:r>
               <w:rPr>
                 <w:rFonts w:ascii="Google Sans" w:eastAsia="Google Sans" w:hAnsi="Google Sans" w:cs="Google Sans"/>
-                <w:b/>
-                <w:bCs/>
-                <w:color w:val="1F1F1F"/>
               </w:rPr>
               <w:t>0.1040</w:t>
             </w:r>
@@ -1840,16 +1756,15 @@
           <w:tcPr>
             <w:tcW w:w="4680" w:type="dxa"/>
             <w:tcBorders>
-              <w:top w:val="single" w:sz="6" w:space="0" w:color="000000"/>
-              <w:left w:val="single" w:sz="6" w:space="0" w:color="000000"/>
-              <w:bottom w:val="single" w:sz="6" w:space="0" w:color="000000"/>
-              <w:right w:val="single" w:sz="6" w:space="0" w:color="000000"/>
+              <w:top w:val="single" w:sz="6" w:space="0" w:color="E2E8F0"/>
+              <w:left w:val="single" w:sz="6" w:space="0" w:color="E2E8F0"/>
+              <w:bottom w:val="single" w:sz="6" w:space="0" w:color="E2E8F0"/>
+              <w:right w:val="single" w:sz="6" w:space="0" w:color="E2E8F0"/>
             </w:tcBorders>
-            <w:shd w:val="clear" w:color="auto" w:fill="F8FAFD"/>
             <w:tcMar>
-              <w:top w:w="120" w:type="dxa"/>
+              <w:top w:w="180" w:type="dxa"/>
               <w:left w:w="180" w:type="dxa"/>
-              <w:bottom w:w="120" w:type="dxa"/>
+              <w:bottom w:w="180" w:type="dxa"/>
               <w:right w:w="180" w:type="dxa"/>
             </w:tcMar>
           </w:tcPr>
@@ -1862,20 +1777,14 @@
                 <w:right w:val="nil"/>
                 <w:between w:val="nil"/>
               </w:pBdr>
-              <w:spacing w:line="275" w:lineRule="auto"/>
+              <w:spacing w:before="180" w:after="180"/>
               <w:rPr>
                 <w:rFonts w:ascii="Google Sans" w:eastAsia="Google Sans" w:hAnsi="Google Sans" w:cs="Google Sans"/>
-                <w:b/>
-                <w:bCs/>
-                <w:color w:val="1F1F1F"/>
               </w:rPr>
             </w:pPr>
             <w:r>
               <w:rPr>
                 <w:rFonts w:ascii="Google Sans" w:eastAsia="Google Sans" w:hAnsi="Google Sans" w:cs="Google Sans"/>
-                <w:b/>
-                <w:bCs/>
-                <w:color w:val="1F1F1F"/>
               </w:rPr>
               <w:t>METEOR</w:t>
             </w:r>
@@ -1885,16 +1794,15 @@
           <w:tcPr>
             <w:tcW w:w="4680" w:type="dxa"/>
             <w:tcBorders>
-              <w:top w:val="single" w:sz="6" w:space="0" w:color="000000"/>
-              <w:left w:val="single" w:sz="6" w:space="0" w:color="000000"/>
-              <w:bottom w:val="single" w:sz="6" w:space="0" w:color="000000"/>
-              <w:right w:val="single" w:sz="6" w:space="0" w:color="000000"/>
+              <w:top w:val="single" w:sz="6" w:space="0" w:color="E2E8F0"/>
+              <w:left w:val="single" w:sz="6" w:space="0" w:color="E2E8F0"/>
+              <w:bottom w:val="single" w:sz="6" w:space="0" w:color="E2E8F0"/>
+              <w:right w:val="single" w:sz="6" w:space="0" w:color="E2E8F0"/>
             </w:tcBorders>
-            <w:shd w:val="clear" w:color="auto" w:fill="F8FAFD"/>
             <w:tcMar>
-              <w:top w:w="120" w:type="dxa"/>
+              <w:top w:w="180" w:type="dxa"/>
               <w:left w:w="180" w:type="dxa"/>
-              <w:bottom w:w="120" w:type="dxa"/>
+              <w:bottom w:w="180" w:type="dxa"/>
               <w:right w:w="180" w:type="dxa"/>
             </w:tcMar>
           </w:tcPr>
@@ -1907,20 +1815,14 @@
                 <w:right w:val="nil"/>
                 <w:between w:val="nil"/>
               </w:pBdr>
-              <w:spacing w:line="275" w:lineRule="auto"/>
+              <w:spacing w:before="180" w:after="180"/>
               <w:rPr>
                 <w:rFonts w:ascii="Google Sans" w:eastAsia="Google Sans" w:hAnsi="Google Sans" w:cs="Google Sans"/>
-                <w:b/>
-                <w:bCs/>
-                <w:color w:val="1F1F1F"/>
               </w:rPr>
             </w:pPr>
             <w:r>
               <w:rPr>
                 <w:rFonts w:ascii="Google Sans" w:eastAsia="Google Sans" w:hAnsi="Google Sans" w:cs="Google Sans"/>
-                <w:b/>
-                <w:bCs/>
-                <w:color w:val="1F1F1F"/>
               </w:rPr>
               <w:t>0.1776</w:t>
             </w:r>
@@ -1931,18 +1833,16 @@
     <w:p>
       <w:pPr>
         <w:pStyle w:val="Heading2"/>
-        <w:spacing w:before="480" w:after="120" w:line="275" w:lineRule="auto"/>
-        <w:rPr>
-          <w:rFonts w:ascii="Google Sans" w:eastAsia="Google Sans" w:hAnsi="Google Sans" w:cs="Google Sans"/>
-          <w:color w:val="1F1F1F"/>
-        </w:rPr>
-      </w:pPr>
-      <w:r>
-        <w:rPr>
-          <w:rFonts w:ascii="Google Sans" w:eastAsia="Google Sans" w:hAnsi="Google Sans" w:cs="Google Sans"/>
-          <w:color w:val="1F1F1F"/>
-        </w:rPr>
-        <w:t>4. System Implementation (UI)</w:t>
+        <w:spacing w:before="450" w:after="300"/>
+        <w:rPr>
+          <w:rFonts w:ascii="Google Sans" w:eastAsia="Google Sans" w:hAnsi="Google Sans" w:cs="Google Sans"/>
+        </w:rPr>
+      </w:pPr>
+      <w:r>
+        <w:rPr>
+          <w:rFonts w:ascii="Google Sans" w:eastAsia="Google Sans" w:hAnsi="Google Sans" w:cs="Google Sans"/>
+        </w:rPr>
+        <w:t>6. Discussion</w:t>
       </w:r>
     </w:p>
     <w:p>
@@ -1954,36 +1854,92 @@
           <w:right w:val="nil"/>
           <w:between w:val="nil"/>
         </w:pBdr>
-        <w:spacing w:after="120" w:line="275" w:lineRule="auto"/>
-        <w:rPr>
-          <w:rFonts w:ascii="Google Sans" w:eastAsia="Google Sans" w:hAnsi="Google Sans" w:cs="Google Sans"/>
-          <w:color w:val="1F1F1F"/>
-        </w:rPr>
-      </w:pPr>
-      <w:r>
-        <w:rPr>
-          <w:rFonts w:ascii="Google Sans" w:eastAsia="Google Sans" w:hAnsi="Google Sans" w:cs="Google Sans"/>
-          <w:color w:val="1F1F1F"/>
-        </w:rPr>
-        <w:t xml:space="preserve">The system is deployed via </w:t>
-      </w:r>
-      <w:proofErr w:type="spellStart"/>
+        <w:spacing w:after="450" w:line="300" w:lineRule="auto"/>
+        <w:rPr>
+          <w:rFonts w:ascii="Google Sans" w:eastAsia="Google Sans" w:hAnsi="Google Sans" w:cs="Google Sans"/>
+        </w:rPr>
+      </w:pPr>
+      <w:r>
+        <w:pict w14:anchorId="4A9063AE">
+          <v:rect id="_x0000_i1030" style="width:0;height:1.5pt" o:hralign="center" o:hrstd="t" o:hr="t" fillcolor="#a0a0a0" stroked="f"/>
+        </w:pict>
+      </w:r>
+      <w:r>
+        <w:rPr>
+          <w:rFonts w:ascii="Google Sans" w:eastAsia="Google Sans" w:hAnsi="Google Sans" w:cs="Google Sans"/>
+        </w:rPr>
+        <w:t xml:space="preserve">The implementation successfully addressed the </w:t>
+      </w:r>
       <w:r>
         <w:rPr>
           <w:rFonts w:ascii="Google Sans" w:eastAsia="Google Sans" w:hAnsi="Google Sans" w:cs="Google Sans"/>
           <w:b/>
           <w:bCs/>
-          <w:color w:val="1F1F1F"/>
-        </w:rPr>
-        <w:t>Streamlit</w:t>
-      </w:r>
-      <w:proofErr w:type="spellEnd"/>
-      <w:r>
-        <w:rPr>
-          <w:rFonts w:ascii="Google Sans" w:eastAsia="Google Sans" w:hAnsi="Google Sans" w:cs="Google Sans"/>
-          <w:color w:val="1F1F1F"/>
-        </w:rPr>
-        <w:t>.</w:t>
+        </w:rPr>
+        <w:t>Precision-Recall trade-off</w:t>
+      </w:r>
+      <w:r>
+        <w:rPr>
+          <w:rFonts w:ascii="Google Sans" w:eastAsia="Google Sans" w:hAnsi="Google Sans" w:cs="Google Sans"/>
+        </w:rPr>
+        <w:t xml:space="preserve"> inherent in imbalanced datasets. By lowering the regularization parameter and balancing class weights, the system improved Class 1 recall from 0.00 to 0.54. This signifies a move from a trivial model to one that genuinely identifies textual evidence. Furthermore, total inference time remains under 1.0 second, confirming the viability of TF-IDF pipelines for real-time educational software on consumer hardware.</w:t>
+      </w:r>
+    </w:p>
+    <w:p>
+      <w:pPr>
+        <w:pStyle w:val="Heading2"/>
+        <w:spacing w:before="0" w:after="300"/>
+        <w:rPr>
+          <w:rFonts w:ascii="Google Sans" w:eastAsia="Google Sans" w:hAnsi="Google Sans" w:cs="Google Sans"/>
+        </w:rPr>
+      </w:pPr>
+      <w:r>
+        <w:rPr>
+          <w:rFonts w:ascii="Google Sans" w:eastAsia="Google Sans" w:hAnsi="Google Sans" w:cs="Google Sans"/>
+        </w:rPr>
+        <w:lastRenderedPageBreak/>
+        <w:t>7. Conclusion</w:t>
+      </w:r>
+    </w:p>
+    <w:p>
+      <w:pPr>
+        <w:pBdr>
+          <w:top w:val="nil"/>
+          <w:left w:val="nil"/>
+          <w:bottom w:val="nil"/>
+          <w:right w:val="nil"/>
+          <w:between w:val="nil"/>
+        </w:pBdr>
+        <w:spacing w:after="450" w:line="300" w:lineRule="auto"/>
+        <w:rPr>
+          <w:rFonts w:ascii="Google Sans" w:eastAsia="Google Sans" w:hAnsi="Google Sans" w:cs="Google Sans"/>
+        </w:rPr>
+      </w:pPr>
+      <w:r>
+        <w:pict w14:anchorId="204CF12A">
+          <v:rect id="_x0000_i1031" style="width:0;height:1.5pt" o:hralign="center" o:hrstd="t" o:hr="t" fillcolor="#a0a0a0" stroked="f"/>
+        </w:pict>
+      </w:r>
+      <w:r>
+        <w:rPr>
+          <w:rFonts w:ascii="Google Sans" w:eastAsia="Google Sans" w:hAnsi="Google Sans" w:cs="Google Sans"/>
+        </w:rPr>
+        <w:t xml:space="preserve">The Intelligent Reading Comprehension system provides a robust framework for automated testing. By training on the full RACE dataset and optimizing for consumer-grade hardware, the project demonstrates that high-utility AI tools can be developed without massive GPU overhead. </w:t>
+      </w:r>
+    </w:p>
+    <w:p>
+      <w:pPr>
+        <w:pStyle w:val="Heading2"/>
+        <w:spacing w:before="0" w:after="300"/>
+        <w:rPr>
+          <w:rFonts w:ascii="Google Sans" w:eastAsia="Google Sans" w:hAnsi="Google Sans" w:cs="Google Sans"/>
+        </w:rPr>
+      </w:pPr>
+      <w:r>
+        <w:rPr>
+          <w:rFonts w:ascii="Google Sans" w:eastAsia="Google Sans" w:hAnsi="Google Sans" w:cs="Google Sans"/>
+        </w:rPr>
+        <w:t>8. Citations</w:t>
       </w:r>
     </w:p>
     <w:p>
@@ -1999,39 +1955,60 @@
           <w:right w:val="nil"/>
           <w:between w:val="nil"/>
         </w:pBdr>
-        <w:spacing w:line="275" w:lineRule="auto"/>
-      </w:pPr>
-      <w:r>
-        <w:rPr>
-          <w:rFonts w:ascii="Google Sans" w:eastAsia="Google Sans" w:hAnsi="Google Sans" w:cs="Google Sans"/>
-          <w:b/>
-          <w:bCs/>
-          <w:color w:val="1F1F1F"/>
-        </w:rPr>
-        <w:t>Model Checkpointing:</w:t>
-      </w:r>
-      <w:r>
-        <w:rPr>
-          <w:rFonts w:ascii="Google Sans" w:eastAsia="Google Sans" w:hAnsi="Google Sans" w:cs="Google Sans"/>
-          <w:color w:val="1F1F1F"/>
-        </w:rPr>
-        <w:t xml:space="preserve"> The system loads pre-trained .</w:t>
+        <w:spacing w:line="300" w:lineRule="auto"/>
+      </w:pPr>
+      <w:r>
+        <w:pict w14:anchorId="42CCA1C3">
+          <v:rect id="_x0000_i1032" style="width:0;height:1.5pt" o:hralign="center" o:hrstd="t" o:hr="t" fillcolor="#a0a0a0" stroked="f"/>
+        </w:pict>
+      </w:r>
+      <w:r>
+        <w:rPr>
+          <w:rFonts w:ascii="Google Sans" w:eastAsia="Google Sans" w:hAnsi="Google Sans" w:cs="Google Sans"/>
+        </w:rPr>
+        <w:t xml:space="preserve">Lai, G., Xie, Q., Liu, H., Yang, Y., &amp; </w:t>
       </w:r>
       <w:proofErr w:type="spellStart"/>
       <w:r>
         <w:rPr>
           <w:rFonts w:ascii="Google Sans" w:eastAsia="Google Sans" w:hAnsi="Google Sans" w:cs="Google Sans"/>
-          <w:color w:val="1F1F1F"/>
-        </w:rPr>
-        <w:t>pkl</w:t>
+        </w:rPr>
+        <w:t>Hovy</w:t>
       </w:r>
       <w:proofErr w:type="spellEnd"/>
       <w:r>
         <w:rPr>
           <w:rFonts w:ascii="Google Sans" w:eastAsia="Google Sans" w:hAnsi="Google Sans" w:cs="Google Sans"/>
-          <w:color w:val="1F1F1F"/>
-        </w:rPr>
-        <w:t xml:space="preserve"> files (Vectorizers and Classifiers), allowing the app to run without re-training.</w:t>
+        </w:rPr>
+        <w:t xml:space="preserve">, E. (2017). RACE: Large-scale </w:t>
+      </w:r>
+      <w:proofErr w:type="spellStart"/>
+      <w:r>
+        <w:rPr>
+          <w:rFonts w:ascii="Google Sans" w:eastAsia="Google Sans" w:hAnsi="Google Sans" w:cs="Google Sans"/>
+        </w:rPr>
+        <w:t>ReAdability</w:t>
+      </w:r>
+      <w:proofErr w:type="spellEnd"/>
+      <w:r>
+        <w:rPr>
+          <w:rFonts w:ascii="Google Sans" w:eastAsia="Google Sans" w:hAnsi="Google Sans" w:cs="Google Sans"/>
+        </w:rPr>
+        <w:t xml:space="preserve"> Dataset for Comprehension Evaluation from Examinations. </w:t>
+      </w:r>
+      <w:proofErr w:type="spellStart"/>
+      <w:r>
+        <w:rPr>
+          <w:rFonts w:ascii="Google Sans" w:eastAsia="Google Sans" w:hAnsi="Google Sans" w:cs="Google Sans"/>
+        </w:rPr>
+        <w:t>arXiv</w:t>
+      </w:r>
+      <w:proofErr w:type="spellEnd"/>
+      <w:r>
+        <w:rPr>
+          <w:rFonts w:ascii="Google Sans" w:eastAsia="Google Sans" w:hAnsi="Google Sans" w:cs="Google Sans"/>
+        </w:rPr>
+        <w:t xml:space="preserve"> preprint arXiv:1704.04683.</w:t>
       </w:r>
     </w:p>
     <w:p>
@@ -2047,216 +2024,20 @@
           <w:right w:val="nil"/>
           <w:between w:val="nil"/>
         </w:pBdr>
-        <w:spacing w:after="120" w:line="275" w:lineRule="auto"/>
-      </w:pPr>
-      <w:r>
-        <w:rPr>
-          <w:noProof/>
-        </w:rPr>
-        <w:lastRenderedPageBreak/>
-        <w:drawing>
-          <wp:anchor distT="0" distB="0" distL="114300" distR="114300" simplePos="0" relativeHeight="251660288" behindDoc="0" locked="0" layoutInCell="1" allowOverlap="1" wp14:anchorId="6D2C8102" wp14:editId="7A00A7F1">
-            <wp:simplePos x="0" y="0"/>
-            <wp:positionH relativeFrom="margin">
-              <wp:align>right</wp:align>
-            </wp:positionH>
-            <wp:positionV relativeFrom="paragraph">
-              <wp:posOffset>2691202</wp:posOffset>
-            </wp:positionV>
-            <wp:extent cx="5943600" cy="1918970"/>
-            <wp:effectExtent l="0" t="0" r="0" b="5080"/>
-            <wp:wrapThrough wrapText="bothSides">
-              <wp:wrapPolygon edited="0">
-                <wp:start x="0" y="0"/>
-                <wp:lineTo x="0" y="21443"/>
-                <wp:lineTo x="21531" y="21443"/>
-                <wp:lineTo x="21531" y="0"/>
-                <wp:lineTo x="0" y="0"/>
-              </wp:wrapPolygon>
-            </wp:wrapThrough>
-            <wp:docPr id="2013651129" name="Picture 1"/>
-            <wp:cNvGraphicFramePr>
-              <a:graphicFrameLocks xmlns:a="http://schemas.openxmlformats.org/drawingml/2006/main" noChangeAspect="1"/>
-            </wp:cNvGraphicFramePr>
-            <a:graphic xmlns:a="http://schemas.openxmlformats.org/drawingml/2006/main">
-              <a:graphicData uri="http://schemas.openxmlformats.org/drawingml/2006/picture">
-                <pic:pic xmlns:pic="http://schemas.openxmlformats.org/drawingml/2006/picture">
-                  <pic:nvPicPr>
-                    <pic:cNvPr id="2013651129" name=""/>
-                    <pic:cNvPicPr/>
-                  </pic:nvPicPr>
-                  <pic:blipFill>
-                    <a:blip r:embed="rId7" cstate="print">
-                      <a:extLst>
-                        <a:ext uri="{28A0092B-C50C-407E-A947-70E740481C1C}">
-                          <a14:useLocalDpi xmlns:a14="http://schemas.microsoft.com/office/drawing/2010/main" val="0"/>
-                        </a:ext>
-                      </a:extLst>
-                    </a:blip>
-                    <a:stretch>
-                      <a:fillRect/>
-                    </a:stretch>
-                  </pic:blipFill>
-                  <pic:spPr>
-                    <a:xfrm>
-                      <a:off x="0" y="0"/>
-                      <a:ext cx="5943600" cy="1918970"/>
-                    </a:xfrm>
-                    <a:prstGeom prst="rect">
-                      <a:avLst/>
-                    </a:prstGeom>
-                  </pic:spPr>
-                </pic:pic>
-              </a:graphicData>
-            </a:graphic>
-          </wp:anchor>
-        </w:drawing>
-      </w:r>
-      <w:r>
-        <w:rPr>
-          <w:rFonts w:ascii="Google Sans" w:eastAsia="Google Sans" w:hAnsi="Google Sans" w:cs="Google Sans"/>
-          <w:b/>
-          <w:bCs/>
-          <w:color w:val="1F1F1F"/>
-        </w:rPr>
-        <w:t>Developer Dashboard:</w:t>
-      </w:r>
-      <w:r>
-        <w:rPr>
-          <w:rFonts w:ascii="Google Sans" w:eastAsia="Google Sans" w:hAnsi="Google Sans" w:cs="Google Sans"/>
-          <w:color w:val="1F1F1F"/>
-        </w:rPr>
-        <w:t xml:space="preserve"> Provides real-time metrics and verifies checkpoint integrity.</w:t>
-      </w:r>
-      <w:r>
-        <w:rPr>
-          <w:rFonts w:ascii="Google Sans" w:eastAsia="Google Sans" w:hAnsi="Google Sans" w:cs="Google Sans"/>
-          <w:b/>
-          <w:bCs/>
-          <w:noProof/>
-          <w:color w:val="1F1F1F"/>
-        </w:rPr>
-        <w:drawing>
-          <wp:anchor distT="0" distB="0" distL="114300" distR="114300" simplePos="0" relativeHeight="251659264" behindDoc="0" locked="0" layoutInCell="1" allowOverlap="1" wp14:anchorId="5C39E34F" wp14:editId="1FCC41AF">
-            <wp:simplePos x="0" y="0"/>
-            <wp:positionH relativeFrom="margin">
-              <wp:align>right</wp:align>
-            </wp:positionH>
-            <wp:positionV relativeFrom="paragraph">
-              <wp:posOffset>254875</wp:posOffset>
-            </wp:positionV>
-            <wp:extent cx="5943600" cy="2340610"/>
-            <wp:effectExtent l="0" t="0" r="0" b="2540"/>
-            <wp:wrapThrough wrapText="bothSides">
-              <wp:wrapPolygon edited="0">
-                <wp:start x="0" y="0"/>
-                <wp:lineTo x="0" y="21448"/>
-                <wp:lineTo x="21531" y="21448"/>
-                <wp:lineTo x="21531" y="0"/>
-                <wp:lineTo x="0" y="0"/>
-              </wp:wrapPolygon>
-            </wp:wrapThrough>
-            <wp:docPr id="1820536343" name="Picture 1"/>
-            <wp:cNvGraphicFramePr>
-              <a:graphicFrameLocks xmlns:a="http://schemas.openxmlformats.org/drawingml/2006/main" noChangeAspect="1"/>
-            </wp:cNvGraphicFramePr>
-            <a:graphic xmlns:a="http://schemas.openxmlformats.org/drawingml/2006/main">
-              <a:graphicData uri="http://schemas.openxmlformats.org/drawingml/2006/picture">
-                <pic:pic xmlns:pic="http://schemas.openxmlformats.org/drawingml/2006/picture">
-                  <pic:nvPicPr>
-                    <pic:cNvPr id="1820536343" name=""/>
-                    <pic:cNvPicPr/>
-                  </pic:nvPicPr>
-                  <pic:blipFill>
-                    <a:blip r:embed="rId8" cstate="print">
-                      <a:extLst>
-                        <a:ext uri="{28A0092B-C50C-407E-A947-70E740481C1C}">
-                          <a14:useLocalDpi xmlns:a14="http://schemas.microsoft.com/office/drawing/2010/main" val="0"/>
-                        </a:ext>
-                      </a:extLst>
-                    </a:blip>
-                    <a:stretch>
-                      <a:fillRect/>
-                    </a:stretch>
-                  </pic:blipFill>
-                  <pic:spPr>
-                    <a:xfrm>
-                      <a:off x="0" y="0"/>
-                      <a:ext cx="5943600" cy="2340610"/>
-                    </a:xfrm>
-                    <a:prstGeom prst="rect">
-                      <a:avLst/>
-                    </a:prstGeom>
-                  </pic:spPr>
-                </pic:pic>
-              </a:graphicData>
-            </a:graphic>
-          </wp:anchor>
-        </w:drawing>
-      </w:r>
-    </w:p>
-    <w:p>
-      <w:pPr>
-        <w:pStyle w:val="Heading2"/>
-        <w:spacing w:before="240" w:after="120" w:line="275" w:lineRule="auto"/>
-        <w:rPr>
-          <w:rFonts w:ascii="Google Sans" w:eastAsia="Google Sans" w:hAnsi="Google Sans" w:cs="Google Sans"/>
-          <w:color w:val="1F1F1F"/>
-        </w:rPr>
-      </w:pPr>
-      <w:r>
-        <w:rPr>
-          <w:rFonts w:ascii="Google Sans" w:eastAsia="Google Sans" w:hAnsi="Google Sans" w:cs="Google Sans"/>
-          <w:color w:val="1F1F1F"/>
-        </w:rPr>
-        <w:t>5. Discussion</w:t>
-      </w:r>
-    </w:p>
-    <w:p>
-      <w:pPr>
-        <w:pStyle w:val="Heading3"/>
-        <w:spacing w:before="0" w:after="120" w:line="275" w:lineRule="auto"/>
-        <w:rPr>
-          <w:rFonts w:ascii="Google Sans" w:eastAsia="Google Sans" w:hAnsi="Google Sans" w:cs="Google Sans"/>
-          <w:color w:val="1F1F1F"/>
-        </w:rPr>
-      </w:pPr>
-      <w:r>
-        <w:rPr>
-          <w:rFonts w:ascii="Google Sans" w:eastAsia="Google Sans" w:hAnsi="Google Sans" w:cs="Google Sans"/>
-          <w:color w:val="1F1F1F"/>
-        </w:rPr>
-        <w:t>5.1 Technical Constraint Compliance (10.1)</w:t>
-      </w:r>
-    </w:p>
-    <w:p>
-      <w:pPr>
-        <w:pBdr>
-          <w:top w:val="nil"/>
-          <w:left w:val="nil"/>
-          <w:bottom w:val="nil"/>
-          <w:right w:val="nil"/>
-          <w:between w:val="nil"/>
-        </w:pBdr>
-        <w:spacing w:after="120" w:line="275" w:lineRule="auto"/>
-        <w:rPr>
-          <w:rFonts w:ascii="Google Sans" w:eastAsia="Google Sans" w:hAnsi="Google Sans" w:cs="Google Sans"/>
-          <w:color w:val="1F1F1F"/>
-        </w:rPr>
-      </w:pPr>
-      <w:r>
-        <w:rPr>
-          <w:rFonts w:ascii="Google Sans" w:eastAsia="Google Sans" w:hAnsi="Google Sans" w:cs="Google Sans"/>
-          <w:color w:val="1F1F1F"/>
-        </w:rPr>
-        <w:t>The project strictly adheres to hardware and timing constraints.</w:t>
+        <w:spacing w:line="300" w:lineRule="auto"/>
+      </w:pPr>
+      <w:r>
+        <w:rPr>
+          <w:rFonts w:ascii="Google Sans" w:eastAsia="Google Sans" w:hAnsi="Google Sans" w:cs="Google Sans"/>
+        </w:rPr>
+        <w:t>Pedregosa, F., et al. (2011). Scikit-learn: Machine Learning in Python. Journal of Machine Learning Research, 12, 2825-2830.</w:t>
       </w:r>
     </w:p>
     <w:p>
       <w:pPr>
         <w:numPr>
           <w:ilvl w:val="0"/>
-          <w:numId w:val="5"/>
+          <w:numId w:val="4"/>
         </w:numPr>
         <w:pBdr>
           <w:top w:val="nil"/>
@@ -2265,216 +2046,27 @@
           <w:right w:val="nil"/>
           <w:between w:val="nil"/>
         </w:pBdr>
-        <w:spacing w:line="275" w:lineRule="auto"/>
-      </w:pPr>
-      <w:r>
-        <w:rPr>
-          <w:rFonts w:ascii="Google Sans" w:eastAsia="Google Sans" w:hAnsi="Google Sans" w:cs="Google Sans"/>
-          <w:b/>
-          <w:bCs/>
-          <w:color w:val="1F1F1F"/>
-        </w:rPr>
-        <w:t>Training Time:</w:t>
-      </w:r>
-      <w:r>
-        <w:rPr>
-          <w:rFonts w:ascii="Google Sans" w:eastAsia="Google Sans" w:hAnsi="Google Sans" w:cs="Google Sans"/>
-          <w:color w:val="1F1F1F"/>
-        </w:rPr>
-        <w:t xml:space="preserve"> ~5-7 minutes on Ryzen 5 5600X for 350k rows.</w:t>
-      </w:r>
-    </w:p>
-    <w:p>
-      <w:pPr>
-        <w:numPr>
-          <w:ilvl w:val="0"/>
-          <w:numId w:val="5"/>
-        </w:numPr>
-        <w:pBdr>
-          <w:top w:val="nil"/>
-          <w:left w:val="nil"/>
-          <w:bottom w:val="nil"/>
-          <w:right w:val="nil"/>
-          <w:between w:val="nil"/>
-        </w:pBdr>
-        <w:spacing w:line="275" w:lineRule="auto"/>
-      </w:pPr>
-      <w:r>
-        <w:rPr>
-          <w:rFonts w:ascii="Google Sans" w:eastAsia="Google Sans" w:hAnsi="Google Sans" w:cs="Google Sans"/>
-          <w:b/>
-          <w:bCs/>
-          <w:color w:val="1F1F1F"/>
-        </w:rPr>
-        <w:t>Inference Speed:</w:t>
-      </w:r>
-      <w:r>
-        <w:rPr>
-          <w:rFonts w:ascii="Google Sans" w:eastAsia="Google Sans" w:hAnsi="Google Sans" w:cs="Google Sans"/>
-          <w:color w:val="1F1F1F"/>
-        </w:rPr>
-        <w:t xml:space="preserve"> Total quiz generation time is </w:t>
-      </w:r>
-      <w:r>
-        <w:rPr>
-          <w:rFonts w:ascii="Google Sans" w:eastAsia="Google Sans" w:hAnsi="Google Sans" w:cs="Google Sans"/>
-          <w:b/>
-          <w:bCs/>
-          <w:color w:val="1F1F1F"/>
-        </w:rPr>
-        <w:t>&lt;1.0 seconds</w:t>
-      </w:r>
-      <w:r>
-        <w:rPr>
-          <w:rFonts w:ascii="Google Sans" w:eastAsia="Google Sans" w:hAnsi="Google Sans" w:cs="Google Sans"/>
-          <w:color w:val="1F1F1F"/>
-        </w:rPr>
-        <w:t>, well within the 10-second limit.</w:t>
-      </w:r>
-    </w:p>
-    <w:p>
-      <w:pPr>
-        <w:numPr>
-          <w:ilvl w:val="0"/>
-          <w:numId w:val="5"/>
-        </w:numPr>
-        <w:pBdr>
-          <w:top w:val="nil"/>
-          <w:left w:val="nil"/>
-          <w:bottom w:val="nil"/>
-          <w:right w:val="nil"/>
-          <w:between w:val="nil"/>
-        </w:pBdr>
-        <w:spacing w:after="120" w:line="275" w:lineRule="auto"/>
-      </w:pPr>
-      <w:r>
-        <w:rPr>
-          <w:rFonts w:ascii="Google Sans" w:eastAsia="Google Sans" w:hAnsi="Google Sans" w:cs="Google Sans"/>
-          <w:b/>
-          <w:bCs/>
-          <w:color w:val="1F1F1F"/>
-        </w:rPr>
-        <w:t>Memory Management:</w:t>
-      </w:r>
-      <w:r>
-        <w:rPr>
-          <w:rFonts w:ascii="Google Sans" w:eastAsia="Google Sans" w:hAnsi="Google Sans" w:cs="Google Sans"/>
-          <w:color w:val="1F1F1F"/>
-        </w:rPr>
-        <w:t xml:space="preserve"> Sparse matrix operations were tuned to fit within 32GB RAM without requiring GPU VRAM.</w:t>
-      </w:r>
-    </w:p>
-    <w:p>
-      <w:pPr>
-        <w:pStyle w:val="Heading3"/>
-        <w:spacing w:before="120" w:after="120" w:line="275" w:lineRule="auto"/>
-        <w:rPr>
-          <w:rFonts w:ascii="Google Sans" w:eastAsia="Google Sans" w:hAnsi="Google Sans" w:cs="Google Sans"/>
-          <w:color w:val="1F1F1F"/>
-        </w:rPr>
-      </w:pPr>
-      <w:r>
-        <w:rPr>
-          <w:rFonts w:ascii="Google Sans" w:eastAsia="Google Sans" w:hAnsi="Google Sans" w:cs="Google Sans"/>
-          <w:color w:val="1F1F1F"/>
-        </w:rPr>
-        <w:t>5.2 Precision-Recall Trade-off</w:t>
-      </w:r>
-    </w:p>
-    <w:p>
-      <w:pPr>
-        <w:pBdr>
-          <w:top w:val="nil"/>
-          <w:left w:val="nil"/>
-          <w:bottom w:val="nil"/>
-          <w:right w:val="nil"/>
-          <w:between w:val="nil"/>
-        </w:pBdr>
-        <w:spacing w:after="240" w:line="275" w:lineRule="auto"/>
-        <w:rPr>
-          <w:rFonts w:ascii="Google Sans" w:eastAsia="Google Sans" w:hAnsi="Google Sans" w:cs="Google Sans"/>
-          <w:color w:val="1F1F1F"/>
-        </w:rPr>
-      </w:pPr>
-      <w:r>
-        <w:rPr>
-          <w:rFonts w:ascii="Google Sans" w:eastAsia="Google Sans" w:hAnsi="Google Sans" w:cs="Google Sans"/>
-          <w:color w:val="1F1F1F"/>
-        </w:rPr>
-        <w:t xml:space="preserve">While the 39% accuracy appears lower than the 75% baseline, it represents a mathematically superior model. The baseline model had a </w:t>
-      </w:r>
-      <w:r>
-        <w:rPr>
-          <w:rFonts w:ascii="Google Sans" w:eastAsia="Google Sans" w:hAnsi="Google Sans" w:cs="Google Sans"/>
-          <w:b/>
-          <w:bCs/>
-          <w:color w:val="1F1F1F"/>
-        </w:rPr>
-        <w:t>Recall of 0.00</w:t>
-      </w:r>
-      <w:r>
-        <w:rPr>
-          <w:rFonts w:ascii="Google Sans" w:eastAsia="Google Sans" w:hAnsi="Google Sans" w:cs="Google Sans"/>
-          <w:color w:val="1F1F1F"/>
-        </w:rPr>
-        <w:t xml:space="preserve"> for correct answers. Our balanced model achieved a </w:t>
-      </w:r>
-      <w:r>
-        <w:rPr>
-          <w:rFonts w:ascii="Google Sans" w:eastAsia="Google Sans" w:hAnsi="Google Sans" w:cs="Google Sans"/>
-          <w:b/>
-          <w:bCs/>
-          <w:color w:val="1F1F1F"/>
-        </w:rPr>
-        <w:t>Recall of 0.25</w:t>
-      </w:r>
-      <w:r>
-        <w:rPr>
-          <w:rFonts w:ascii="Google Sans" w:eastAsia="Google Sans" w:hAnsi="Google Sans" w:cs="Google Sans"/>
-          <w:color w:val="1F1F1F"/>
-        </w:rPr>
-        <w:t>, proving it is capable of performing the verification task rather than simply exploiting the dataset's label distribution.</w:t>
-      </w:r>
-    </w:p>
-    <w:p>
-      <w:pPr>
-        <w:pStyle w:val="Heading2"/>
-        <w:spacing w:before="0" w:after="120" w:line="275" w:lineRule="auto"/>
-        <w:rPr>
-          <w:rFonts w:ascii="Google Sans" w:eastAsia="Google Sans" w:hAnsi="Google Sans" w:cs="Google Sans"/>
-          <w:color w:val="1F1F1F"/>
-        </w:rPr>
-      </w:pPr>
-      <w:r>
-        <w:rPr>
-          <w:rFonts w:ascii="Google Sans" w:eastAsia="Google Sans" w:hAnsi="Google Sans" w:cs="Google Sans"/>
-          <w:color w:val="1F1F1F"/>
-        </w:rPr>
-        <w:lastRenderedPageBreak/>
-        <w:t>6. Conclusion</w:t>
-      </w:r>
-    </w:p>
-    <w:p>
-      <w:pPr>
-        <w:pBdr>
-          <w:top w:val="nil"/>
-          <w:left w:val="nil"/>
-          <w:bottom w:val="nil"/>
-          <w:right w:val="nil"/>
-          <w:between w:val="nil"/>
-        </w:pBdr>
-        <w:spacing w:after="240" w:line="275" w:lineRule="auto"/>
-        <w:rPr>
-          <w:rFonts w:ascii="Google Sans" w:eastAsia="Google Sans" w:hAnsi="Google Sans" w:cs="Google Sans"/>
-          <w:color w:val="1F1F1F"/>
-        </w:rPr>
-      </w:pPr>
-      <w:r>
-        <w:rPr>
-          <w:rFonts w:ascii="Google Sans" w:eastAsia="Google Sans" w:hAnsi="Google Sans" w:cs="Google Sans"/>
-          <w:color w:val="1F1F1F"/>
-        </w:rPr>
-        <w:t>The Intelligent RC System successfully automates the evaluation and generation of educational quizzes. By utilizing a full-scale dataset and addressing class imbalance, the project fulfills all academic requirements. The results demonstrate that traditional ML models, when properly engineered, remain highly effective and efficient for large-scale NLP tasks on consumer-grade hardware.</w:t>
+        <w:spacing w:line="300" w:lineRule="auto"/>
+      </w:pPr>
+      <w:r>
+        <w:rPr>
+          <w:rFonts w:ascii="Google Sans" w:eastAsia="Google Sans" w:hAnsi="Google Sans" w:cs="Google Sans"/>
+        </w:rPr>
+        <w:t xml:space="preserve">Loper, E., &amp; Bird, S. (2002). NLTK: The Natural Language Toolkit. </w:t>
+      </w:r>
+      <w:proofErr w:type="spellStart"/>
+      <w:r>
+        <w:rPr>
+          <w:rFonts w:ascii="Google Sans" w:eastAsia="Google Sans" w:hAnsi="Google Sans" w:cs="Google Sans"/>
+        </w:rPr>
+        <w:t>arXiv</w:t>
+      </w:r>
+      <w:proofErr w:type="spellEnd"/>
+      <w:r>
+        <w:rPr>
+          <w:rFonts w:ascii="Google Sans" w:eastAsia="Google Sans" w:hAnsi="Google Sans" w:cs="Google Sans"/>
+        </w:rPr>
+        <w:t xml:space="preserve"> preprint cs/0205028.</w:t>
       </w:r>
     </w:p>
     <w:sectPr>
@@ -2490,16 +2082,16 @@
 <file path=word/numbering.xml><?xml version="1.0" encoding="utf-8"?>
 <w:numbering xmlns:wpc="http://schemas.microsoft.com/office/word/2010/wordprocessingCanvas" xmlns:cx="http://schemas.microsoft.com/office/drawing/2014/chartex" xmlns:cx1="http://schemas.microsoft.com/office/drawing/2015/9/8/chartex" xmlns:cx2="http://schemas.microsoft.com/office/drawing/2015/10/21/chartex" xmlns:cx3="http://schemas.microsoft.com/office/drawing/2016/5/9/chartex" xmlns:cx4="http://schemas.microsoft.com/office/drawing/2016/5/10/chartex" xmlns:cx5="http://schemas.microsoft.com/office/drawing/2016/5/11/chartex" xmlns:cx6="http://schemas.microsoft.com/office/drawing/2016/5/12/chartex" xmlns:cx7="http://schemas.microsoft.com/office/drawing/2016/5/13/chartex" xmlns:cx8="http://schemas.microsoft.com/office/drawing/2016/5/14/chartex" xmlns:mc="http://schemas.openxmlformats.org/markup-compatibility/2006" xmlns:aink="http://schemas.microsoft.com/office/drawing/2016/ink" xmlns:am3d="http://schemas.microsoft.com/office/drawing/2017/model3d" xmlns:o="urn:schemas-microsoft-com:office:office" xmlns:oel="http://schemas.microsoft.com/office/2019/extlst" xmlns:r="http://schemas.openxmlformats.org/officeDocument/2006/relationships" xmlns:m="http://schemas.openxmlformats.org/officeDocument/2006/math" xmlns:v="urn:schemas-microsoft-com:vml" xmlns:wp14="http://schemas.microsoft.com/office/word/2010/wordprocessingDrawing" xmlns:wp="http://schemas.openxmlformats.org/drawingml/2006/wordprocessingDrawing" xmlns:w10="urn:schemas-microsoft-com:office:word" xmlns:w="http://schemas.openxmlformats.org/wordprocessingml/2006/main" xmlns:w14="http://schemas.microsoft.com/office/word/2010/wordml" xmlns:w15="http://schemas.microsoft.com/office/word/2012/wordml" xmlns:w16cex="http://schemas.microsoft.com/office/word/2018/wordml/cex" xmlns:w16cid="http://schemas.microsoft.com/office/word/2016/wordml/cid" xmlns:w16="http://schemas.microsoft.com/office/word/2018/wordml" xmlns:w16du="http://schemas.microsoft.com/office/word/2023/wordml/word16du" xmlns:w16sdtdh="http://schemas.microsoft.com/office/word/2020/wordml/sdtdatahash" xmlns:w16sdtfl="http://schemas.microsoft.com/office/word/2024/wordml/sdtformatlock" xmlns:w16se="http://schemas.microsoft.com/office/word/2015/wordml/symex" xmlns:wpg="http://schemas.microsoft.com/office/word/2010/wordprocessingGroup" xmlns:wpi="http://schemas.microsoft.com/office/word/2010/wordprocessingInk" xmlns:wne="http://schemas.microsoft.com/office/word/2006/wordml" xmlns:wps="http://schemas.microsoft.com/office/word/2010/wordprocessingShape" mc:Ignorable="w14 w15 w16se w16cid w16 w16cex w16sdtdh w16sdtfl w16du wp14">
   <w:abstractNum w:abstractNumId="0" w15:restartNumberingAfterBreak="0">
-    <w:nsid w:val="06800D7D"/>
+    <w:nsid w:val="0C2A685F"/>
     <w:multiLevelType w:val="multilevel"/>
-    <w:tmpl w:val="334AF7A6"/>
+    <w:tmpl w:val="BA7822CE"/>
     <w:lvl w:ilvl="0">
       <w:start w:val="1"/>
       <w:numFmt w:val="bullet"/>
       <w:lvlText w:val="●"/>
       <w:lvlJc w:val="left"/>
       <w:pPr>
-        <w:ind w:left="465" w:hanging="360"/>
+        <w:ind w:left="600" w:hanging="360"/>
       </w:pPr>
       <w:rPr>
         <w:rFonts w:ascii="Arial" w:eastAsia="Arial" w:hAnsi="Arial" w:cs="Arial"/>
@@ -2711,16 +2303,16 @@
     </w:lvl>
   </w:abstractNum>
   <w:abstractNum w:abstractNumId="1" w15:restartNumberingAfterBreak="0">
-    <w:nsid w:val="12341358"/>
+    <w:nsid w:val="335F7013"/>
     <w:multiLevelType w:val="multilevel"/>
-    <w:tmpl w:val="B3D6A4EE"/>
+    <w:tmpl w:val="AC0A8F92"/>
     <w:lvl w:ilvl="0">
       <w:start w:val="1"/>
-      <w:numFmt w:val="bullet"/>
-      <w:lvlText w:val="●"/>
+      <w:numFmt w:val="decimal"/>
+      <w:lvlText w:val="%1."/>
       <w:lvlJc w:val="left"/>
       <w:pPr>
-        <w:ind w:left="465" w:hanging="360"/>
+        <w:ind w:left="600" w:hanging="360"/>
       </w:pPr>
       <w:rPr>
         <w:rFonts w:ascii="Arial" w:eastAsia="Arial" w:hAnsi="Arial" w:cs="Arial"/>
@@ -2932,16 +2524,16 @@
     </w:lvl>
   </w:abstractNum>
   <w:abstractNum w:abstractNumId="2" w15:restartNumberingAfterBreak="0">
-    <w:nsid w:val="20F80096"/>
+    <w:nsid w:val="5C64247A"/>
     <w:multiLevelType w:val="multilevel"/>
-    <w:tmpl w:val="663C91B0"/>
+    <w:tmpl w:val="32C87D1C"/>
     <w:lvl w:ilvl="0">
       <w:start w:val="1"/>
       <w:numFmt w:val="bullet"/>
       <w:lvlText w:val="●"/>
       <w:lvlJc w:val="left"/>
       <w:pPr>
-        <w:ind w:left="465" w:hanging="360"/>
+        <w:ind w:left="600" w:hanging="360"/>
       </w:pPr>
       <w:rPr>
         <w:rFonts w:ascii="Arial" w:eastAsia="Arial" w:hAnsi="Arial" w:cs="Arial"/>
@@ -3153,16 +2745,16 @@
     </w:lvl>
   </w:abstractNum>
   <w:abstractNum w:abstractNumId="3" w15:restartNumberingAfterBreak="0">
-    <w:nsid w:val="5EEF3C4C"/>
+    <w:nsid w:val="726F6B75"/>
     <w:multiLevelType w:val="multilevel"/>
-    <w:tmpl w:val="DAAEC784"/>
+    <w:tmpl w:val="474A51AC"/>
     <w:lvl w:ilvl="0">
       <w:start w:val="1"/>
       <w:numFmt w:val="bullet"/>
       <w:lvlText w:val="●"/>
       <w:lvlJc w:val="left"/>
       <w:pPr>
-        <w:ind w:left="465" w:hanging="360"/>
+        <w:ind w:left="600" w:hanging="360"/>
       </w:pPr>
       <w:rPr>
         <w:rFonts w:ascii="Arial" w:eastAsia="Arial" w:hAnsi="Arial" w:cs="Arial"/>
@@ -3373,241 +2965,17 @@
       </w:rPr>
     </w:lvl>
   </w:abstractNum>
-  <w:abstractNum w:abstractNumId="4" w15:restartNumberingAfterBreak="0">
-    <w:nsid w:val="6DC86210"/>
-    <w:multiLevelType w:val="multilevel"/>
-    <w:tmpl w:val="7B9EE25C"/>
-    <w:lvl w:ilvl="0">
-      <w:start w:val="1"/>
-      <w:numFmt w:val="bullet"/>
-      <w:lvlText w:val="●"/>
-      <w:lvlJc w:val="left"/>
-      <w:pPr>
-        <w:ind w:left="465" w:hanging="360"/>
-      </w:pPr>
-      <w:rPr>
-        <w:rFonts w:ascii="Arial" w:eastAsia="Arial" w:hAnsi="Arial" w:cs="Arial"/>
-        <w:b w:val="0"/>
-        <w:bCs w:val="0"/>
-        <w:i w:val="0"/>
-        <w:iCs w:val="0"/>
-        <w:smallCaps w:val="0"/>
-        <w:strike w:val="0"/>
-        <w:color w:val="000000"/>
-        <w:sz w:val="22"/>
-        <w:szCs w:val="22"/>
-        <w:u w:val="none"/>
-        <w:shd w:val="clear" w:color="auto" w:fill="auto"/>
-        <w:vertAlign w:val="baseline"/>
-      </w:rPr>
-    </w:lvl>
-    <w:lvl w:ilvl="1">
-      <w:start w:val="1"/>
-      <w:numFmt w:val="bullet"/>
-      <w:lvlText w:val="○"/>
-      <w:lvlJc w:val="left"/>
-      <w:pPr>
-        <w:ind w:left="1440" w:hanging="360"/>
-      </w:pPr>
-      <w:rPr>
-        <w:rFonts w:ascii="Arial" w:eastAsia="Arial" w:hAnsi="Arial" w:cs="Arial"/>
-        <w:b w:val="0"/>
-        <w:bCs w:val="0"/>
-        <w:i w:val="0"/>
-        <w:iCs w:val="0"/>
-        <w:smallCaps w:val="0"/>
-        <w:strike w:val="0"/>
-        <w:color w:val="000000"/>
-        <w:sz w:val="22"/>
-        <w:szCs w:val="22"/>
-        <w:u w:val="none"/>
-        <w:shd w:val="clear" w:color="auto" w:fill="auto"/>
-        <w:vertAlign w:val="baseline"/>
-      </w:rPr>
-    </w:lvl>
-    <w:lvl w:ilvl="2">
-      <w:start w:val="1"/>
-      <w:numFmt w:val="bullet"/>
-      <w:lvlText w:val="■"/>
-      <w:lvlJc w:val="left"/>
-      <w:pPr>
-        <w:ind w:left="2160" w:hanging="360"/>
-      </w:pPr>
-      <w:rPr>
-        <w:rFonts w:ascii="Arial" w:eastAsia="Arial" w:hAnsi="Arial" w:cs="Arial"/>
-        <w:b w:val="0"/>
-        <w:bCs w:val="0"/>
-        <w:i w:val="0"/>
-        <w:iCs w:val="0"/>
-        <w:smallCaps w:val="0"/>
-        <w:strike w:val="0"/>
-        <w:color w:val="000000"/>
-        <w:sz w:val="22"/>
-        <w:szCs w:val="22"/>
-        <w:u w:val="none"/>
-        <w:shd w:val="clear" w:color="auto" w:fill="auto"/>
-        <w:vertAlign w:val="baseline"/>
-      </w:rPr>
-    </w:lvl>
-    <w:lvl w:ilvl="3">
-      <w:start w:val="1"/>
-      <w:numFmt w:val="bullet"/>
-      <w:lvlText w:val="■"/>
-      <w:lvlJc w:val="left"/>
-      <w:pPr>
-        <w:ind w:left="2880" w:hanging="360"/>
-      </w:pPr>
-      <w:rPr>
-        <w:rFonts w:ascii="Arial" w:eastAsia="Arial" w:hAnsi="Arial" w:cs="Arial"/>
-        <w:b w:val="0"/>
-        <w:bCs w:val="0"/>
-        <w:i w:val="0"/>
-        <w:iCs w:val="0"/>
-        <w:smallCaps w:val="0"/>
-        <w:strike w:val="0"/>
-        <w:color w:val="000000"/>
-        <w:sz w:val="22"/>
-        <w:szCs w:val="22"/>
-        <w:u w:val="none"/>
-        <w:shd w:val="clear" w:color="auto" w:fill="auto"/>
-        <w:vertAlign w:val="baseline"/>
-      </w:rPr>
-    </w:lvl>
-    <w:lvl w:ilvl="4">
-      <w:start w:val="1"/>
-      <w:numFmt w:val="bullet"/>
-      <w:lvlText w:val="■"/>
-      <w:lvlJc w:val="left"/>
-      <w:pPr>
-        <w:ind w:left="3600" w:hanging="360"/>
-      </w:pPr>
-      <w:rPr>
-        <w:rFonts w:ascii="Arial" w:eastAsia="Arial" w:hAnsi="Arial" w:cs="Arial"/>
-        <w:b w:val="0"/>
-        <w:bCs w:val="0"/>
-        <w:i w:val="0"/>
-        <w:iCs w:val="0"/>
-        <w:smallCaps w:val="0"/>
-        <w:strike w:val="0"/>
-        <w:color w:val="000000"/>
-        <w:sz w:val="22"/>
-        <w:szCs w:val="22"/>
-        <w:u w:val="none"/>
-        <w:shd w:val="clear" w:color="auto" w:fill="auto"/>
-        <w:vertAlign w:val="baseline"/>
-      </w:rPr>
-    </w:lvl>
-    <w:lvl w:ilvl="5">
-      <w:start w:val="1"/>
-      <w:numFmt w:val="bullet"/>
-      <w:lvlText w:val="■"/>
-      <w:lvlJc w:val="left"/>
-      <w:pPr>
-        <w:ind w:left="4320" w:hanging="360"/>
-      </w:pPr>
-      <w:rPr>
-        <w:rFonts w:ascii="Arial" w:eastAsia="Arial" w:hAnsi="Arial" w:cs="Arial"/>
-        <w:b w:val="0"/>
-        <w:bCs w:val="0"/>
-        <w:i w:val="0"/>
-        <w:iCs w:val="0"/>
-        <w:smallCaps w:val="0"/>
-        <w:strike w:val="0"/>
-        <w:color w:val="000000"/>
-        <w:sz w:val="22"/>
-        <w:szCs w:val="22"/>
-        <w:u w:val="none"/>
-        <w:shd w:val="clear" w:color="auto" w:fill="auto"/>
-        <w:vertAlign w:val="baseline"/>
-      </w:rPr>
-    </w:lvl>
-    <w:lvl w:ilvl="6">
-      <w:start w:val="1"/>
-      <w:numFmt w:val="bullet"/>
-      <w:lvlText w:val="■"/>
-      <w:lvlJc w:val="left"/>
-      <w:pPr>
-        <w:ind w:left="5040" w:hanging="360"/>
-      </w:pPr>
-      <w:rPr>
-        <w:rFonts w:ascii="Arial" w:eastAsia="Arial" w:hAnsi="Arial" w:cs="Arial"/>
-        <w:b w:val="0"/>
-        <w:bCs w:val="0"/>
-        <w:i w:val="0"/>
-        <w:iCs w:val="0"/>
-        <w:smallCaps w:val="0"/>
-        <w:strike w:val="0"/>
-        <w:color w:val="000000"/>
-        <w:sz w:val="22"/>
-        <w:szCs w:val="22"/>
-        <w:u w:val="none"/>
-        <w:shd w:val="clear" w:color="auto" w:fill="auto"/>
-        <w:vertAlign w:val="baseline"/>
-      </w:rPr>
-    </w:lvl>
-    <w:lvl w:ilvl="7">
-      <w:start w:val="1"/>
-      <w:numFmt w:val="bullet"/>
-      <w:lvlText w:val="■"/>
-      <w:lvlJc w:val="left"/>
-      <w:pPr>
-        <w:ind w:left="5760" w:hanging="360"/>
-      </w:pPr>
-      <w:rPr>
-        <w:rFonts w:ascii="Arial" w:eastAsia="Arial" w:hAnsi="Arial" w:cs="Arial"/>
-        <w:b w:val="0"/>
-        <w:bCs w:val="0"/>
-        <w:i w:val="0"/>
-        <w:iCs w:val="0"/>
-        <w:smallCaps w:val="0"/>
-        <w:strike w:val="0"/>
-        <w:color w:val="000000"/>
-        <w:sz w:val="22"/>
-        <w:szCs w:val="22"/>
-        <w:u w:val="none"/>
-        <w:shd w:val="clear" w:color="auto" w:fill="auto"/>
-        <w:vertAlign w:val="baseline"/>
-      </w:rPr>
-    </w:lvl>
-    <w:lvl w:ilvl="8">
-      <w:start w:val="1"/>
-      <w:numFmt w:val="bullet"/>
-      <w:lvlText w:val="■"/>
-      <w:lvlJc w:val="left"/>
-      <w:pPr>
-        <w:ind w:left="6480" w:hanging="360"/>
-      </w:pPr>
-      <w:rPr>
-        <w:rFonts w:ascii="Arial" w:eastAsia="Arial" w:hAnsi="Arial" w:cs="Arial"/>
-        <w:b w:val="0"/>
-        <w:bCs w:val="0"/>
-        <w:i w:val="0"/>
-        <w:iCs w:val="0"/>
-        <w:smallCaps w:val="0"/>
-        <w:strike w:val="0"/>
-        <w:color w:val="000000"/>
-        <w:sz w:val="22"/>
-        <w:szCs w:val="22"/>
-        <w:u w:val="none"/>
-        <w:shd w:val="clear" w:color="auto" w:fill="auto"/>
-        <w:vertAlign w:val="baseline"/>
-      </w:rPr>
-    </w:lvl>
-  </w:abstractNum>
-  <w:num w:numId="1" w16cid:durableId="182785398">
-    <w:abstractNumId w:val="4"/>
+  <w:num w:numId="1" w16cid:durableId="1802458485">
+    <w:abstractNumId w:val="0"/>
   </w:num>
-  <w:num w:numId="2" w16cid:durableId="1898280344">
-    <w:abstractNumId w:val="1"/>
+  <w:num w:numId="2" w16cid:durableId="1080368730">
+    <w:abstractNumId w:val="2"/>
   </w:num>
-  <w:num w:numId="3" w16cid:durableId="770007689">
+  <w:num w:numId="3" w16cid:durableId="39864341">
     <w:abstractNumId w:val="3"/>
   </w:num>
-  <w:num w:numId="4" w16cid:durableId="377902865">
-    <w:abstractNumId w:val="2"/>
-  </w:num>
-  <w:num w:numId="5" w16cid:durableId="385841405">
-    <w:abstractNumId w:val="0"/>
+  <w:num w:numId="4" w16cid:durableId="1176114508">
+    <w:abstractNumId w:val="1"/>
   </w:num>
 </w:numbering>
 </file>
@@ -4253,13 +3621,6 @@
       <w:tblStyleColBandSize w:val="1"/>
     </w:tblPr>
   </w:style>
-  <w:style w:type="table" w:customStyle="1" w:styleId="a1">
-    <w:basedOn w:val="TableNormal0"/>
-    <w:tblPr>
-      <w:tblStyleRowBandSize w:val="1"/>
-      <w:tblStyleColBandSize w:val="1"/>
-    </w:tblPr>
-  </w:style>
 </w:styles>
 </file>
 

</xml_diff>